<commit_message>
Update the production and pricing documents for the built model
Data, Production, and Aging and Pricing, Control Years, and Contract Value
now describe the directed forecast, the term-in price line on signing-dated
forecasts, the two-rate control-year weight and signing-dated first seasons,
written from the code with figures from 25_TESTS/document_figures.py. The star
under-forecast is re-measured (-0.333 WAR a season one to five out for 3+
trailing wins). Step 6 of the plan of record is complete.

Co-Authored-By: Claude Opus 5.5 <noreply@anthropic.com>
Claude-Session: https://claude.ai/code/session_01KJQGvXbJQHJSXYBMj2qArp
</commit_message>
<xml_diff>
--- a/40_DOCS/Supervisor_Drafts/Data, Production, and Aging.docx
+++ b/40_DOCS/Supervisor_Drafts/Data, Production, and Aging.docx
@@ -311,7 +311,7 @@
         <w:rPr>
           <w:rFonts w:asciiTheme="minorHAnsi" w:hAnsiTheme="minorHAnsi" w:cstheme="minorHAnsi"/>
         </w:rPr>
-        <w:t xml:space="preserve">The rule applies to the fitted parts of the model as well as to the player’s own record. The model is refitted for each valuation date, using only player-seasons whose outcome had finished by then. This covers the starting-rate regression, the aging curve, the games-share regressions, and the chance-of-playing regressions. For example, the 2024 valuation fits each of them on seasons up to 2023-24, and the 2018 valuation on seasons up to 2017-18. No fitted relationship carries information from after the valuation date.</w:t>
+        <w:t xml:space="preserve">The rule applies to the fitted parts of the model as well as to the player’s own record. The model is refitted for each valuation date, using only player-seasons whose outcome had finished by then. This covers the aging curve and its comparables, the league rates the starting rate falls back on, the games-share regressions, and the chance-of-playing regressions. For example, the 2024 valuation fits each of them on seasons up to 2023-24, and the 2018 valuation on seasons up to 2017-18. No fitted relationship carries information from after the valuation date.</w:t>
       </w:r>
     </w:p>
     <w:p>
@@ -338,7 +338,7 @@
         <w:rPr>
           <w:rFonts w:asciiTheme="minorHAnsi" w:hAnsiTheme="minorHAnsi" w:cstheme="minorHAnsi"/>
         </w:rPr>
-        <w:t xml:space="preserve">The starting rate is the model’s estimate of the player’s rate in the valuation season. Each later season is built from it, so an error here carries through the whole contract. The model builds it in two steps: it summarizes recent seasons, then pulls that summary toward what players like him typically produce next.</w:t>
+        <w:t xml:space="preserve">The starting rate is the model’s estimate of the player’s rate in the valuation season. Each later season is built from it, so an error here carries through the whole contract. The model builds it in three steps: it measures his own recent rate, pulls that rate toward the level of similar players, and moves the result forward to his age in the valuation season. The weights in each step are fixed in advance rather than estimated by a regression.</w:t>
       </w:r>
     </w:p>
     <w:p>
@@ -352,59 +352,33 @@
         <w:rPr>
           <w:rFonts w:asciiTheme="minorHAnsi" w:hAnsiTheme="minorHAnsi" w:cstheme="minorHAnsi"/>
         </w:rPr>
-        <w:t xml:space="preserve">Step 1: a trailing total from three seasons</w:t>
-      </w:r>
-    </w:p>
-    <w:p>
-      <w:pPr>
-        <w:rPr>
-          <w:rFonts w:asciiTheme="minorHAnsi" w:hAnsiTheme="minorHAnsi" w:cstheme="minorHAnsi"/>
-        </w:rPr>
-      </w:pPr>
-      <w:r>
-        <w:rPr>
-          <w:rFonts w:asciiTheme="minorHAnsi" w:hAnsiTheme="minorHAnsi" w:cstheme="minorHAnsi"/>
-        </w:rPr>
-        <w:t xml:space="preserve">Any single season is a noisy reading of a player’s ability. The model therefore takes a weighted average of his WAR over the three seasons before the valuation season. A season counts if he played at least ten games in it. A player with no ten-game season among those three has no forecast and is not priced.</w:t>
-      </w:r>
-    </w:p>
-    <w:p>
-      <w:pPr>
-        <w:rPr>
-          <w:rFonts w:asciiTheme="minorHAnsi" w:hAnsiTheme="minorHAnsi" w:cstheme="minorHAnsi"/>
-        </w:rPr>
-      </w:pPr>
-      <w:r>
-        <w:rPr>
-          <w:rFonts w:asciiTheme="minorHAnsi" w:hAnsiTheme="minorHAnsi" w:cstheme="minorHAnsi"/>
-        </w:rPr>
-        <w:t xml:space="preserve">The weights decline geometrically: the most recent season receives weight 1, the one before it d, and the one before that d², and the result is divided by the sum of the weights used. The decay d is chosen anew on each valuation date. The model tries seven values from 0.40 to 1.00 and keeps the one whose weighted per-82 rate best predicts the following season’s rate, using only seasons before the valuation date and weighting each by the games behind it. The chosen value is 0.75 on the 2015 valuation and 0.667 on each valuation from 2016 through 2025. At 0.667 the weights are 47%, 32%, and 21%.</w:t>
-      </w:r>
-    </w:p>
-    <w:p>
-      <w:pPr>
-        <w:rPr>
-          <w:rFonts w:asciiTheme="minorHAnsi" w:hAnsiTheme="minorHAnsi" w:cstheme="minorHAnsi"/>
-        </w:rPr>
-      </w:pPr>
-      <w:r>
-        <w:rPr>
-          <w:rFonts w:asciiTheme="minorHAnsi" w:hAnsiTheme="minorHAnsi" w:cstheme="minorHAnsi"/>
-        </w:rPr>
-        <w:t xml:space="preserve">If a season is missing or under ten games, the remaining weights are rescaled to sum to one. A missing season is not counted as zero production.</w:t>
-      </w:r>
-    </w:p>
-    <w:p>
-      <w:pPr>
-        <w:rPr>
-          <w:rFonts w:asciiTheme="minorHAnsi" w:hAnsiTheme="minorHAnsi" w:cstheme="minorHAnsi"/>
-        </w:rPr>
-      </w:pPr>
-      <w:r>
-        <w:rPr>
-          <w:rFonts w:asciiTheme="minorHAnsi" w:hAnsiTheme="minorHAnsi" w:cstheme="minorHAnsi"/>
-        </w:rPr>
-        <w:t xml:space="preserve">For example, Jonathan Marchessault’s three seasons before 2024-25 produced 2.90, 2.96, and 2.37 WAR. His trailing total is</w:t>
+        <w:t xml:space="preserve">Step 1: his own rate over three seasons</w:t>
+      </w:r>
+    </w:p>
+    <w:p>
+      <w:pPr>
+        <w:rPr>
+          <w:rFonts w:asciiTheme="minorHAnsi" w:hAnsiTheme="minorHAnsi" w:cstheme="minorHAnsi"/>
+        </w:rPr>
+      </w:pPr>
+      <w:r>
+        <w:rPr>
+          <w:rFonts w:asciiTheme="minorHAnsi" w:hAnsiTheme="minorHAnsi" w:cstheme="minorHAnsi"/>
+        </w:rPr>
+        <w:t xml:space="preserve">Any single season is a noisy reading of a player’s ability. The model therefore averages his WAR per 82 games over the three seasons before the valuation season, weighting the most recent season 50%, the one before it 30%, and the one before that 20%. A season counts if he played at least ten games in it. A player with no ten-game season among those three has no forecast and is not priced.</w:t>
+      </w:r>
+    </w:p>
+    <w:p>
+      <w:pPr>
+        <w:rPr>
+          <w:rFonts w:asciiTheme="minorHAnsi" w:hAnsiTheme="minorHAnsi" w:cstheme="minorHAnsi"/>
+        </w:rPr>
+      </w:pPr>
+      <w:r>
+        <w:rPr>
+          <w:rFonts w:asciiTheme="minorHAnsi" w:hAnsiTheme="minorHAnsi" w:cstheme="minorHAnsi"/>
+        </w:rPr>
+        <w:t xml:space="preserve">Each season’s weight is also multiplied by the games he played in it, because a rate built on 30 games is a noisier reading than one built on 80. If a season is missing or under ten games, it drops out and the remaining weights are rescaled, so a missing season is not counted as zero production. With one counted season, that season’s rate is his own rate.</w:t>
       </w:r>
     </w:p>
     <w:p>
@@ -420,60 +394,20 @@
           <w:rFonts w:asciiTheme="minorHAnsi" w:hAnsiTheme="minorHAnsi" w:cstheme="minorHAnsi"/>
           <w:i/>
         </w:rPr>
-        <w:t xml:space="preserve">(1 × 2.90 + 0.667 × 2.96 + 0.444 × 2.37) / (1 + 0.667 + 0.444) = 2.81 WAR</w:t>
-      </w:r>
-    </w:p>
-    <w:p>
-      <w:pPr>
-        <w:rPr>
-          <w:rFonts w:asciiTheme="minorHAnsi" w:hAnsiTheme="minorHAnsi" w:cstheme="minorHAnsi"/>
-        </w:rPr>
-      </w:pPr>
-      <w:r>
-        <w:rPr>
-          <w:rFonts w:asciiTheme="minorHAnsi" w:hAnsiTheme="minorHAnsi" w:cstheme="minorHAnsi"/>
-        </w:rPr>
-        <w:t xml:space="preserve">The third season was tested before it was adopted. In an early development test (valuation dates 2015-2021, before aging and the chance of playing were added), reading three seasons instead of two lowered forecast error at five of six horizons, by 0.8% to 3.4%, and left the sixth level. A fourth season added nothing, and letting the decay differ by forecast horizon changed the error by 0.0005 wins.</w:t>
-      </w:r>
-    </w:p>
-    <w:p>
-      <w:pPr>
-        <w:pStyle w:val="Heading2"/>
-        <w:rPr>
-          <w:rFonts w:asciiTheme="minorHAnsi" w:hAnsiTheme="minorHAnsi" w:cstheme="minorHAnsi"/>
-        </w:rPr>
-      </w:pPr>
-      <w:r>
-        <w:rPr>
-          <w:rFonts w:asciiTheme="minorHAnsi" w:hAnsiTheme="minorHAnsi" w:cstheme="minorHAnsi"/>
-        </w:rPr>
-        <w:t xml:space="preserve">Step 2: pulling the trailing total toward typical</w:t>
-      </w:r>
-    </w:p>
-    <w:p>
-      <w:pPr>
-        <w:rPr>
-          <w:rFonts w:asciiTheme="minorHAnsi" w:hAnsiTheme="minorHAnsi" w:cstheme="minorHAnsi"/>
-        </w:rPr>
-      </w:pPr>
-      <w:r>
-        <w:rPr>
-          <w:rFonts w:asciiTheme="minorHAnsi" w:hAnsiTheme="minorHAnsi" w:cstheme="minorHAnsi"/>
-        </w:rPr>
-        <w:t xml:space="preserve">A player whose recent seasons were well above average tends to produce less the next season, and a player well below average tends to produce more. Part of a strong two- or three-season run is luck, and the luck does not repeat. A forecast that takes the trailing total at face value therefore overstates good players and understates poor ones. In the earlier version of this model, which started from a 60/40 two-season total, players with three or more trailing wins were over-forecast by 0.92 WAR in the valuation season, and players below zero were under-forecast by 0.35.</w:t>
-      </w:r>
-    </w:p>
-    <w:p>
-      <w:pPr>
-        <w:rPr>
-          <w:rFonts w:asciiTheme="minorHAnsi" w:hAnsiTheme="minorHAnsi" w:cstheme="minorHAnsi"/>
-        </w:rPr>
-      </w:pPr>
-      <w:r>
-        <w:rPr>
-          <w:rFonts w:asciiTheme="minorHAnsi" w:hAnsiTheme="minorHAnsi" w:cstheme="minorHAnsi"/>
-        </w:rPr>
-        <w:t xml:space="preserve">The model corrects this with a regression, refitted on each valuation date. For each player-season before that date, it relates the player’s rate in that season to what was known at its start:</w:t>
+        <w:t xml:space="preserve">own rate = sum of (weight × games × rate per 82) / sum of (weight × games)</w:t>
+      </w:r>
+    </w:p>
+    <w:p>
+      <w:pPr>
+        <w:rPr>
+          <w:rFonts w:asciiTheme="minorHAnsi" w:hAnsiTheme="minorHAnsi" w:cstheme="minorHAnsi"/>
+        </w:rPr>
+      </w:pPr>
+      <w:r>
+        <w:rPr>
+          <w:rFonts w:asciiTheme="minorHAnsi" w:hAnsiTheme="minorHAnsi" w:cstheme="minorHAnsi"/>
+        </w:rPr>
+        <w:t xml:space="preserve">For example, Jonathan Marchessault’s three seasons before 2024-25 produced 2.558 WAR per 82 in 76 games (2021-22), 3.194 in 76 games (2022-23), and 2.898 in 82 games (2023-24). His own rate is</w:t>
       </w:r>
     </w:p>
     <w:p>
@@ -489,33 +423,681 @@
           <w:rFonts w:asciiTheme="minorHAnsi" w:hAnsiTheme="minorHAnsi" w:cstheme="minorHAnsi"/>
           <w:i/>
         </w:rPr>
-        <w:t xml:space="preserve">rate = a + b1 × trailing total + b2 × max(trailing total − 1, 0) + b3 × trailing total × evidence + b4 × one season only + b5 × defence + b6 × experience + b7 × (age − 27) + b8 × (age − 27)²</w:t>
-      </w:r>
-    </w:p>
-    <w:p>
-      <w:pPr>
-        <w:rPr>
-          <w:rFonts w:asciiTheme="minorHAnsi" w:hAnsiTheme="minorHAnsi" w:cstheme="minorHAnsi"/>
-        </w:rPr>
-      </w:pPr>
-      <w:r>
-        <w:rPr>
-          <w:rFonts w:asciiTheme="minorHAnsi" w:hAnsiTheme="minorHAnsi" w:cstheme="minorHAnsi"/>
-        </w:rPr>
-        <w:t xml:space="preserve">Each term has a job. The trailing total carries the player’s level. The second term lets the slope change above one win, because good players keep more of their level than average ones. Evidence is the weighted number of games behind the trailing total, divided by 82, so the third term lets a total built on more games count for more. One season only flags a trailing total built on a single season. Defence, NHL seasons of experience, and age complete the list. Each season in the fit is weighted by the games played in it, because a rate computed from a handful of games is a much noisier reading than a full season’s.</w:t>
-      </w:r>
-    </w:p>
-    <w:p>
-      <w:pPr>
-        <w:rPr>
-          <w:rFonts w:asciiTheme="minorHAnsi" w:hAnsiTheme="minorHAnsi" w:cstheme="minorHAnsi"/>
-        </w:rPr>
-      </w:pPr>
-      <w:r>
-        <w:rPr>
-          <w:rFonts w:asciiTheme="minorHAnsi" w:hAnsiTheme="minorHAnsi" w:cstheme="minorHAnsi"/>
-        </w:rPr>
-        <w:t xml:space="preserve">The regression fitted for the 2024 valuation is below. Standard errors are clustered by player, because the same player appears in many seasons.</w:t>
+        <w:t xml:space="preserve">(0.5 × 82 × 2.898 + 0.3 × 76 × 3.194 + 0.2 × 76 × 2.558) / (0.5 × 82 + 0.3 × 76 + 0.2 × 76) = 2.918 WAR per 82</w:t>
+      </w:r>
+    </w:p>
+    <w:p>
+      <w:pPr>
+        <w:rPr>
+          <w:rFonts w:asciiTheme="minorHAnsi" w:hAnsiTheme="minorHAnsi" w:cstheme="minorHAnsi"/>
+        </w:rPr>
+      </w:pPr>
+      <w:r>
+        <w:rPr>
+          <w:rFonts w:asciiTheme="minorHAnsi" w:hAnsiTheme="minorHAnsi" w:cstheme="minorHAnsi"/>
+        </w:rPr>
+        <w:t xml:space="preserve">These weights were tested on the development valuation dates, 2015-2021. Among nine simple three-season weightings, 50/30/20 had the lowest error. Weighting each season by its games lowered the error of the valuation-season rate from 1.1526 to 1.1506 WAR per 82, measured as the root mean squared error (RMSE) over seasons played. It lowered the error one to five seasons out from 1.3618 to 1.3598, and it was lower in 1,827 and 1,802 of 2,000 resamples of whole careers. The gain comes from players with a recent short season. An earlier test found that reading three seasons instead of two lowered forecast error at five of six horizons, and that a fourth season added nothing.</w:t>
+      </w:r>
+    </w:p>
+    <w:p>
+      <w:pPr>
+        <w:pStyle w:val="Heading2"/>
+        <w:rPr>
+          <w:rFonts w:asciiTheme="minorHAnsi" w:hAnsiTheme="minorHAnsi" w:cstheme="minorHAnsi"/>
+        </w:rPr>
+      </w:pPr>
+      <w:r>
+        <w:rPr>
+          <w:rFonts w:asciiTheme="minorHAnsi" w:hAnsiTheme="minorHAnsi" w:cstheme="minorHAnsi"/>
+        </w:rPr>
+        <w:t xml:space="preserve">Step 2: pulling his rate toward similar players</w:t>
+      </w:r>
+    </w:p>
+    <w:p>
+      <w:pPr>
+        <w:rPr>
+          <w:rFonts w:asciiTheme="minorHAnsi" w:hAnsiTheme="minorHAnsi" w:cstheme="minorHAnsi"/>
+        </w:rPr>
+      </w:pPr>
+      <w:r>
+        <w:rPr>
+          <w:rFonts w:asciiTheme="minorHAnsi" w:hAnsiTheme="minorHAnsi" w:cstheme="minorHAnsi"/>
+        </w:rPr>
+        <w:t xml:space="preserve">A player whose recent seasons were well above average tends to produce less the next season, and a player well below average tends to produce more. Part of a strong two- or three-season run is luck, and the luck does not repeat. A forecast that takes his recent seasons at face value therefore overstates good players and understates poor ones. In the earlier version of this model, which started from a 60/40 two-season total, players with three or more trailing wins were over-forecast by 0.92 WAR in the valuation season, and players below zero were under-forecast by 0.35.</w:t>
+      </w:r>
+    </w:p>
+    <w:p>
+      <w:pPr>
+        <w:rPr>
+          <w:rFonts w:asciiTheme="minorHAnsi" w:hAnsiTheme="minorHAnsi" w:cstheme="minorHAnsi"/>
+        </w:rPr>
+      </w:pPr>
+      <w:r>
+        <w:rPr>
+          <w:rFonts w:asciiTheme="minorHAnsi" w:hAnsiTheme="minorHAnsi" w:cstheme="minorHAnsi"/>
+        </w:rPr>
+        <w:t xml:space="preserve">The model corrects this by blending his own rate with the level of his comparables, which are players who resembled him at the same age:</w:t>
+      </w:r>
+    </w:p>
+    <w:p>
+      <w:pPr>
+        <w:spacing w:after="200"/>
+        <w:ind w:left="720"/>
+        <w:rPr>
+          <w:rFonts w:asciiTheme="minorHAnsi" w:hAnsiTheme="minorHAnsi" w:cstheme="minorHAnsi"/>
+        </w:rPr>
+      </w:pPr>
+      <w:r>
+        <w:rPr>
+          <w:rFonts w:asciiTheme="minorHAnsi" w:hAnsiTheme="minorHAnsi" w:cstheme="minorHAnsi"/>
+          <w:i/>
+        </w:rPr>
+        <w:t xml:space="preserve">blended rate = 0.65 × own rate + 0.35 × comparables’ level</w:t>
+      </w:r>
+    </w:p>
+    <w:p>
+      <w:pPr>
+        <w:rPr>
+          <w:rFonts w:asciiTheme="minorHAnsi" w:hAnsiTheme="minorHAnsi" w:cstheme="minorHAnsi"/>
+        </w:rPr>
+      </w:pPr>
+      <w:r>
+        <w:rPr>
+          <w:rFonts w:asciiTheme="minorHAnsi" w:hAnsiTheme="minorHAnsi" w:cstheme="minorHAnsi"/>
+        </w:rPr>
+        <w:t xml:space="preserve">The comparables’ level is the weighted average level, at the age of his last counted season, of the players most similar to him at that age, mixed with the league average for his position and age. Section 4 explains how the comparables are found and weighted; the same comparables supply his aging. The model uses this one 65/35 blend wherever it weighs a player’s own level against his comparables’.</w:t>
+      </w:r>
+    </w:p>
+    <w:p>
+      <w:pPr>
+        <w:rPr>
+          <w:rFonts w:asciiTheme="minorHAnsi" w:hAnsiTheme="minorHAnsi" w:cstheme="minorHAnsi"/>
+        </w:rPr>
+      </w:pPr>
+      <w:r>
+        <w:rPr>
+          <w:rFonts w:asciiTheme="minorHAnsi" w:hAnsiTheme="minorHAnsi" w:cstheme="minorHAnsi"/>
+        </w:rPr>
+        <w:t xml:space="preserve">For Marchessault, the comparables’ level at age 33 is 1.289 WAR per 82, and the league average for forwards of 33 is 0.899. The comparables’ weights sum to 143.7 against the league average’s fixed weight of ten, so the league average carries 6.5% and the blended level is 1.264. His blended rate is 0.65 × 2.918 + 0.35 × 1.264 = 2.339.</w:t>
+      </w:r>
+    </w:p>
+    <w:p>
+      <w:pPr>
+        <w:rPr>
+          <w:rFonts w:asciiTheme="minorHAnsi" w:hAnsiTheme="minorHAnsi" w:cstheme="minorHAnsi"/>
+        </w:rPr>
+      </w:pPr>
+      <w:r>
+        <w:rPr>
+          <w:rFonts w:asciiTheme="minorHAnsi" w:hAnsiTheme="minorHAnsi" w:cstheme="minorHAnsi"/>
+        </w:rPr>
+        <w:t xml:space="preserve">His comparables’ level is less than half of his own rate, because the weighting in Section 4 separates players only loosely. In practice the 35% pulls a player toward a level close to the average for his age and position.</w:t>
+      </w:r>
+    </w:p>
+    <w:p>
+      <w:pPr>
+        <w:rPr>
+          <w:rFonts w:asciiTheme="minorHAnsi" w:hAnsiTheme="minorHAnsi" w:cstheme="minorHAnsi"/>
+        </w:rPr>
+      </w:pPr>
+      <w:r>
+        <w:rPr>
+          <w:rFonts w:asciiTheme="minorHAnsi" w:hAnsiTheme="minorHAnsi" w:cstheme="minorHAnsi"/>
+        </w:rPr>
+        <w:t xml:space="preserve">The 65/35 blend had the lowest error among the pulls tested, and a three-way blend that also allowed the league average its own weight gave it none. The fixed weights cost some accuracy: on the development valuations, the valuation-season error was 0.9% higher than that of an eight-term regression on the trailing record used in an earlier version (1.1502 against 1.1398 WAR per 82). Letting the comparables alone set their level, without the league average, left the starting rate’s error unchanged (1.1505 against 1.1506) and raised the error one to five seasons out from 1.3598 to 1.3678.</w:t>
+      </w:r>
+    </w:p>
+    <w:p>
+      <w:pPr>
+        <w:pStyle w:val="Heading2"/>
+        <w:rPr>
+          <w:rFonts w:asciiTheme="minorHAnsi" w:hAnsiTheme="minorHAnsi" w:cstheme="minorHAnsi"/>
+        </w:rPr>
+      </w:pPr>
+      <w:r>
+        <w:rPr>
+          <w:rFonts w:asciiTheme="minorHAnsi" w:hAnsiTheme="minorHAnsi" w:cstheme="minorHAnsi"/>
+        </w:rPr>
+        <w:t xml:space="preserve">Step 3: moving the rate to the valuation season</w:t>
+      </w:r>
+    </w:p>
+    <w:p>
+      <w:pPr>
+        <w:rPr>
+          <w:rFonts w:asciiTheme="minorHAnsi" w:hAnsiTheme="minorHAnsi" w:cstheme="minorHAnsi"/>
+        </w:rPr>
+      </w:pPr>
+      <w:r>
+        <w:rPr>
+          <w:rFonts w:asciiTheme="minorHAnsi" w:hAnsiTheme="minorHAnsi" w:cstheme="minorHAnsi"/>
+        </w:rPr>
+        <w:t xml:space="preserve">Both his own rate and his comparables’ level describe him at the age of his last counted season, which is normally the season before the valuation season, when he was a year younger. The model therefore adds his comparables’ expected change in rate from that age to his age in the valuation season, taken from the aging curve in Section 4. If his last counted season was two or three seasons back, the change covers each of those years. For Marchessault the change from age 33 to 34 is -0.269, so his starting rate is 2.339 - 0.269 = 2.070 WAR per 82.</w:t>
+      </w:r>
+    </w:p>
+    <w:p>
+      <w:pPr>
+        <w:rPr>
+          <w:rFonts w:asciiTheme="minorHAnsi" w:hAnsiTheme="minorHAnsi" w:cstheme="minorHAnsi"/>
+        </w:rPr>
+      </w:pPr>
+      <w:r>
+        <w:rPr>
+          <w:rFonts w:asciiTheme="minorHAnsi" w:hAnsiTheme="minorHAnsi" w:cstheme="minorHAnsi"/>
+        </w:rPr>
+        <w:t xml:space="preserve">Without this step the valuation-season error was 1.1611 against 1.1506 with it, and the step lowered the error on each of 36 error measures compared across four versions of the start.</w:t>
+      </w:r>
+    </w:p>
+    <w:p>
+      <w:pPr>
+        <w:pStyle w:val="Heading2"/>
+        <w:rPr>
+          <w:rFonts w:asciiTheme="minorHAnsi" w:hAnsiTheme="minorHAnsi" w:cstheme="minorHAnsi"/>
+        </w:rPr>
+      </w:pPr>
+      <w:r>
+        <w:rPr>
+          <w:rFonts w:asciiTheme="minorHAnsi" w:hAnsiTheme="minorHAnsi" w:cstheme="minorHAnsi"/>
+        </w:rPr>
+        <w:t xml:space="preserve">Where the starting rate misses</w:t>
+      </w:r>
+    </w:p>
+    <w:p>
+      <w:pPr>
+        <w:rPr>
+          <w:rFonts w:asciiTheme="minorHAnsi" w:hAnsiTheme="minorHAnsi" w:cstheme="minorHAnsi"/>
+        </w:rPr>
+      </w:pPr>
+      <w:r>
+        <w:rPr>
+          <w:rFonts w:asciiTheme="minorHAnsi" w:hAnsiTheme="minorHAnsi" w:cstheme="minorHAnsi"/>
+        </w:rPr>
+        <w:t xml:space="preserve">The starting rate runs high for players with short histories. On the development valuations it was too high by 0.166 WAR per 82 for players with one counted season (95% range +0.069 to +0.257) and by 0.100 for two, against -0.008 for three. His own rate is not the cause: alone, it runs high by 0.015 to 0.062 in the three groups. The comparables’ level is: alone, it runs high by 0.374 for one-season players. Changes to the comparables for these players lowered the starting rate’s error but raised the error in later seasons, and none was adopted.</w:t>
+      </w:r>
+    </w:p>
+    <w:p>
+      <w:pPr>
+        <w:rPr>
+          <w:rFonts w:asciiTheme="minorHAnsi" w:hAnsiTheme="minorHAnsi" w:cstheme="minorHAnsi"/>
+        </w:rPr>
+      </w:pPr>
+      <w:r>
+        <w:rPr>
+          <w:rFonts w:asciiTheme="minorHAnsi" w:hAnsiTheme="minorHAnsi" w:cstheme="minorHAnsi"/>
+        </w:rPr>
+        <w:t xml:space="preserve">The best players are under-forecast. On the development valuations, players with three or more trailing wins (a 60/40 total of their last two seasons) were under-forecast by 0.333 WAR a season one to five seasons out, and by 0.035 in the valuation season. The 95% range for the first figure is -0.63 to -0.01, from 2,000 resamples of the 88 players’ careers. Each trailing-win group is under-forecast one to five seasons out, by 0.038 to 0.115 WAR a season below three wins, so the miss is largest for the best players. Which step causes it has not been established.</w:t>
+      </w:r>
+    </w:p>
+    <w:p>
+      <w:pPr>
+        <w:pStyle w:val="Heading1"/>
+        <w:rPr>
+          <w:rFonts w:asciiTheme="minorHAnsi" w:hAnsiTheme="minorHAnsi" w:cstheme="minorHAnsi"/>
+        </w:rPr>
+      </w:pPr>
+      <w:r>
+        <w:rPr>
+          <w:rFonts w:asciiTheme="minorHAnsi" w:hAnsiTheme="minorHAnsi" w:cstheme="minorHAnsi"/>
+        </w:rPr>
+        <w:t xml:space="preserve">4. How the Rate Changes with Age</w:t>
+      </w:r>
+    </w:p>
+    <w:p>
+      <w:pPr>
+        <w:rPr>
+          <w:rFonts w:asciiTheme="minorHAnsi" w:hAnsiTheme="minorHAnsi" w:cstheme="minorHAnsi"/>
+        </w:rPr>
+      </w:pPr>
+      <w:r>
+        <w:rPr>
+          <w:rFonts w:asciiTheme="minorHAnsi" w:hAnsiTheme="minorHAnsi" w:cstheme="minorHAnsi"/>
+        </w:rPr>
+        <w:t xml:space="preserve">The starting rate describes the valuation season. A contract also runs through later seasons in which the player will be older, and production changes with age at different speeds for different kinds of players. The model estimates those changes from the later careers of players who resembled him at the same age. It then adds the changes to his starting rate.</w:t>
+      </w:r>
+    </w:p>
+    <w:p>
+      <w:pPr>
+        <w:pStyle w:val="Heading2"/>
+        <w:rPr>
+          <w:rFonts w:asciiTheme="minorHAnsi" w:hAnsiTheme="minorHAnsi" w:cstheme="minorHAnsi"/>
+        </w:rPr>
+      </w:pPr>
+      <w:r>
+        <w:rPr>
+          <w:rFonts w:asciiTheme="minorHAnsi" w:hAnsiTheme="minorHAnsi" w:cstheme="minorHAnsi"/>
+        </w:rPr>
+        <w:t xml:space="preserve">Describing the player at his last counted age</w:t>
+      </w:r>
+    </w:p>
+    <w:p>
+      <w:pPr>
+        <w:rPr>
+          <w:rFonts w:asciiTheme="minorHAnsi" w:hAnsiTheme="minorHAnsi" w:cstheme="minorHAnsi"/>
+        </w:rPr>
+      </w:pPr>
+      <w:r>
+        <w:rPr>
+          <w:rFonts w:asciiTheme="minorHAnsi" w:hAnsiTheme="minorHAnsi" w:cstheme="minorHAnsi"/>
+        </w:rPr>
+        <w:t xml:space="preserve">The model describes the player at the age of his last counted season, the most recent of his three trailing seasons with ten or more games; for a valuation in 2024-25 that is normally his age in 2023-24. The curve uses only seasons of at least 20 games. If his last counted season has fewer than 20, he has no profile at that age, and the model uses the league-average changes described below. Twenty games is the curve’s eligibility threshold, with no claim that it is the best possible cutoff.</w:t>
+      </w:r>
+    </w:p>
+    <w:p>
+      <w:pPr>
+        <w:rPr>
+          <w:rFonts w:asciiTheme="minorHAnsi" w:hAnsiTheme="minorHAnsi" w:cstheme="minorHAnsi"/>
+        </w:rPr>
+      </w:pPr>
+      <w:r>
+        <w:rPr>
+          <w:rFonts w:asciiTheme="minorHAnsi" w:hAnsiTheme="minorHAnsi" w:cstheme="minorHAnsi"/>
+        </w:rPr>
+        <w:t xml:space="preserve">The description, called a profile, contains eight measures. Five describe playing style: the shares of his WAR that came from even-strength offence, even-strength defence, the power play, the penalty kill, and shooting. The other three are ice time per game, his level, and his trend. His level is the three-season measure of Section 3 applied by age: the 50/30/20 average of his rates at this age and the two before, each weight multiplied by games, over seasons of 20 games or more. The style shares and ice time come from his last two seasons if they are consecutive, or the last alone, and his trend is the change in his rate between those two seasons, or zero with one. Each measure is put on a common scale within position, so that minutes do not dominate wins because their numbers are larger.</w:t>
+      </w:r>
+    </w:p>
+    <w:p>
+      <w:pPr>
+        <w:pStyle w:val="Heading2"/>
+        <w:rPr>
+          <w:rFonts w:asciiTheme="minorHAnsi" w:hAnsiTheme="minorHAnsi" w:cstheme="minorHAnsi"/>
+        </w:rPr>
+      </w:pPr>
+      <w:r>
+        <w:rPr>
+          <w:rFonts w:asciiTheme="minorHAnsi" w:hAnsiTheme="minorHAnsi" w:cstheme="minorHAnsi"/>
+        </w:rPr>
+        <w:t xml:space="preserve">Weighting the comparables</w:t>
+      </w:r>
+    </w:p>
+    <w:p>
+      <w:pPr>
+        <w:rPr>
+          <w:rFonts w:asciiTheme="minorHAnsi" w:hAnsiTheme="minorHAnsi" w:cstheme="minorHAnsi"/>
+        </w:rPr>
+      </w:pPr>
+      <w:r>
+        <w:rPr>
+          <w:rFonts w:asciiTheme="minorHAnsi" w:hAnsiTheme="minorHAnsi" w:cstheme="minorHAnsi"/>
+        </w:rPr>
+        <w:t xml:space="preserve">The comparables are the historical profiles of players at the same age and position. Each player contributes one profile for each pair of consecutive 20-game seasons in his career, and the player being valued is excluded from his own comparables.</w:t>
+      </w:r>
+    </w:p>
+    <w:p>
+      <w:pPr>
+        <w:rPr>
+          <w:rFonts w:asciiTheme="minorHAnsi" w:hAnsiTheme="minorHAnsi" w:cstheme="minorHAnsi"/>
+        </w:rPr>
+      </w:pPr>
+      <w:r>
+        <w:rPr>
+          <w:rFonts w:asciiTheme="minorHAnsi" w:hAnsiTheme="minorHAnsi" w:cstheme="minorHAnsi"/>
+        </w:rPr>
+        <w:t xml:space="preserve">The model measures the distance between the player’s profile and each comparable’s, then turns the distance into a weight:</w:t>
+      </w:r>
+    </w:p>
+    <w:p>
+      <w:pPr>
+        <w:spacing w:after="200"/>
+        <w:ind w:left="720"/>
+        <w:rPr>
+          <w:rFonts w:asciiTheme="minorHAnsi" w:hAnsiTheme="minorHAnsi" w:cstheme="minorHAnsi"/>
+        </w:rPr>
+      </w:pPr>
+      <w:r>
+        <w:rPr>
+          <w:rFonts w:asciiTheme="minorHAnsi" w:hAnsiTheme="minorHAnsi" w:cstheme="minorHAnsi"/>
+          <w:i/>
+        </w:rPr>
+        <w:t xml:space="preserve">weight = exp(−distance² / (2 × yardstick²))</w:t>
+      </w:r>
+    </w:p>
+    <w:p>
+      <w:pPr>
+        <w:rPr>
+          <w:rFonts w:asciiTheme="minorHAnsi" w:hAnsiTheme="minorHAnsi" w:cstheme="minorHAnsi"/>
+        </w:rPr>
+      </w:pPr>
+      <w:r>
+        <w:rPr>
+          <w:rFonts w:asciiTheme="minorHAnsi" w:hAnsiTheme="minorHAnsi" w:cstheme="minorHAnsi"/>
+        </w:rPr>
+        <w:t xml:space="preserve">The four groups of measures (style, ice time, level, and trend) receive equal weight in the distance. The five style measures share one group’s weight. The yardstick sets how quickly weight falls with distance. It is the median distance between sampled pairs of profiles, computed separately for forwards and for defencemen; on the 2024 valuation it is 2.573 for forwards and 2.548 for defencemen. An exact match receives a weight of 1, a comparable one yardstick away about 0.61, and one twice as far about 0.14. There is no fixed number of comparables; each eligible profile counts in proportion to its weight. This form, a Gaussian kernel, is standard in nonparametric regression [ref needed: a kernel-weighted nearest-neighbour reference].</w:t>
+      </w:r>
+    </w:p>
+    <w:p>
+      <w:pPr>
+        <w:rPr>
+          <w:rFonts w:asciiTheme="minorHAnsi" w:hAnsiTheme="minorHAnsi" w:cstheme="minorHAnsi"/>
+        </w:rPr>
+      </w:pPr>
+      <w:r>
+        <w:rPr>
+          <w:rFonts w:asciiTheme="minorHAnsi" w:hAnsiTheme="minorHAnsi" w:cstheme="minorHAnsi"/>
+        </w:rPr>
+        <w:t xml:space="preserve">Because the yardstick is the typical distance between two profiles, weight falls off slowly. For Marchessault at 33, 127 of the 230 forward profiles at that age lie within one yardstick of his, and the weights are as evenly spread as those of 206 equal comparables. A separate yardstick for each position changed the forecast’s error by at most 0.0001 WAR per 82.</w:t>
+      </w:r>
+    </w:p>
+    <w:p>
+      <w:pPr>
+        <w:pStyle w:val="Heading2"/>
+        <w:rPr>
+          <w:rFonts w:asciiTheme="minorHAnsi" w:hAnsiTheme="minorHAnsi" w:cstheme="minorHAnsi"/>
+        </w:rPr>
+      </w:pPr>
+      <w:r>
+        <w:rPr>
+          <w:rFonts w:asciiTheme="minorHAnsi" w:hAnsiTheme="minorHAnsi" w:cstheme="minorHAnsi"/>
+        </w:rPr>
+        <w:t xml:space="preserve">Stabilizing the estimate with the league average</w:t>
+      </w:r>
+    </w:p>
+    <w:p>
+      <w:pPr>
+        <w:rPr>
+          <w:rFonts w:asciiTheme="minorHAnsi" w:hAnsiTheme="minorHAnsi" w:cstheme="minorHAnsi"/>
+        </w:rPr>
+      </w:pPr>
+      <w:r>
+        <w:rPr>
+          <w:rFonts w:asciiTheme="minorHAnsi" w:hAnsiTheme="minorHAnsi" w:cstheme="minorHAnsi"/>
+        </w:rPr>
+        <w:t xml:space="preserve">A small or poorly matched group of comparables could produce an extreme estimate on its own. To guard against that, the model mixes the comparables’ average with the league average for the same position and age. The league average counts as ten units of weight, and the comparables count as the sum of the weights of those who have a value at that age. When the comparables are many and close, their weights sum well above ten and they dominate; when they are few or distant, the league average takes over. Marchessault’s comparables’ weights sum to 143.7, so the league average carries 6.5% of their level; with weights summing to 20, it would carry a third.</w:t>
+      </w:r>
+    </w:p>
+    <w:p>
+      <w:pPr>
+        <w:pStyle w:val="Heading2"/>
+        <w:rPr>
+          <w:rFonts w:asciiTheme="minorHAnsi" w:hAnsiTheme="minorHAnsi" w:cstheme="minorHAnsi"/>
+        </w:rPr>
+      </w:pPr>
+      <w:r>
+        <w:rPr>
+          <w:rFonts w:asciiTheme="minorHAnsi" w:hAnsiTheme="minorHAnsi" w:cstheme="minorHAnsi"/>
+        </w:rPr>
+        <w:t xml:space="preserve">Measuring change within players, departures included</w:t>
+      </w:r>
+    </w:p>
+    <w:p>
+      <w:pPr>
+        <w:rPr>
+          <w:rFonts w:asciiTheme="minorHAnsi" w:hAnsiTheme="minorHAnsi" w:cstheme="minorHAnsi"/>
+        </w:rPr>
+      </w:pPr>
+      <w:r>
+        <w:rPr>
+          <w:rFonts w:asciiTheme="minorHAnsi" w:hAnsiTheme="minorHAnsi" w:cstheme="minorHAnsi"/>
+        </w:rPr>
+        <w:t xml:space="preserve">For each comparable, the model measures the change in his level from one age to the next. If a comparable’s level fell from 2.2 at age 33 to 2.0 at age 34, his change is minus 0.2. The weighted average of these changes, mixed with the league-average change in the same way as the level, is the player’s expected change at that age. The comparables chosen at the last counted age stay fixed as the projection moves to later ages; each later step asks how those same players changed next.</w:t>
+      </w:r>
+    </w:p>
+    <w:p>
+      <w:pPr>
+        <w:rPr>
+          <w:rFonts w:asciiTheme="minorHAnsi" w:hAnsiTheme="minorHAnsi" w:cstheme="minorHAnsi"/>
+        </w:rPr>
+      </w:pPr>
+      <w:r>
+        <w:rPr>
+          <w:rFonts w:asciiTheme="minorHAnsi" w:hAnsiTheme="minorHAnsi" w:cstheme="minorHAnsi"/>
+        </w:rPr>
+        <w:t xml:space="preserve">Measuring the level over three seasons, rather than as the equal average of a player’s last two, lowered the error one to five seasons out from 1.3642 to 1.3610 WAR per 82, lower in 1,999 of 2,000 career resamples. It was slightly worse one season out (1.2620 against 1.2603).</w:t>
+      </w:r>
+    </w:p>
+    <w:p>
+      <w:pPr>
+        <w:rPr>
+          <w:rFonts w:asciiTheme="minorHAnsi" w:hAnsiTheme="minorHAnsi" w:cstheme="minorHAnsi"/>
+        </w:rPr>
+      </w:pPr>
+      <w:r>
+        <w:rPr>
+          <w:rFonts w:asciiTheme="minorHAnsi" w:hAnsiTheme="minorHAnsi" w:cstheme="minorHAnsi"/>
+        </w:rPr>
+        <w:t xml:space="preserve">Measuring change within players compares each player with himself a year later. Comparing separate groups of 33-year-olds and 34-year-olds would give a different and misleading answer, because weaker players leave between those ages.</w:t>
+      </w:r>
+    </w:p>
+    <w:p>
+      <w:pPr>
+        <w:rPr>
+          <w:rFonts w:asciiTheme="minorHAnsi" w:hAnsiTheme="minorHAnsi" w:cstheme="minorHAnsi"/>
+        </w:rPr>
+      </w:pPr>
+      <w:r>
+        <w:rPr>
+          <w:rFonts w:asciiTheme="minorHAnsi" w:hAnsiTheme="minorHAnsi" w:cstheme="minorHAnsi"/>
+        </w:rPr>
+        <w:t xml:space="preserve">Measuring within players does not solve the problem completely, because a player who leaves the league never records the season in which he would have declined. The aging curve would then describe only the players who kept their jobs. To correct for this, the model fills in the missing season. A comparable who played a season and has no NHL record of any kind the next season is entered as if he had played that next season at replacement level, which is zero on the WAR scale. The filled-in season counts as many games as his last one. His imputed level is computed by the curve’s own three-season rule, so the zero enters as one season among three. A player who appears again at a later age before the valuation date is not treated as having left. The league-average changes are recomputed with these imputed departures included. Only departures whose next season had finished before the valuation date are imputed. On the 2024 valuation, 881 departures enter the curve this way.</w:t>
+      </w:r>
+    </w:p>
+    <w:p>
+      <w:pPr>
+        <w:rPr>
+          <w:rFonts w:asciiTheme="minorHAnsi" w:hAnsiTheme="minorHAnsi" w:cstheme="minorHAnsi"/>
+        </w:rPr>
+      </w:pPr>
+      <w:r>
+        <w:rPr>
+          <w:rFonts w:asciiTheme="minorHAnsi" w:hAnsiTheme="minorHAnsi" w:cstheme="minorHAnsi"/>
+        </w:rPr>
+        <w:t xml:space="preserve">Replacement level is an identifying assumption, not a measurement. Some departing players were injured and would have been above replacement, so the imputation is better read as a bound on decline than as a point estimate. The assumption matters for the later seasons. Without imputed departures, the error one to five seasons out rises from 1.3598 to 1.3612. Entering departures at a quarter-win per 82 above replacement lowers it to 1.3552, and entering them a quarter-win below raises it to 1.3670. The level was left at replacement. Treating returning players as present and entering a departed season at the player’s own games, together with the separate yardsticks, lowered the error one to five seasons out from 1.3598 to 1.3587, lower in each of 2,000 career resamples.</w:t>
+      </w:r>
+    </w:p>
+    <w:p>
+      <w:pPr>
+        <w:pStyle w:val="Heading2"/>
+        <w:rPr>
+          <w:rFonts w:asciiTheme="minorHAnsi" w:hAnsiTheme="minorHAnsi" w:cstheme="minorHAnsi"/>
+        </w:rPr>
+      </w:pPr>
+      <w:r>
+        <w:rPr>
+          <w:rFonts w:asciiTheme="minorHAnsi" w:hAnsiTheme="minorHAnsi" w:cstheme="minorHAnsi"/>
+        </w:rPr>
+        <w:t xml:space="preserve">Adding the changes to the starting rate</w:t>
+      </w:r>
+    </w:p>
+    <w:p>
+      <w:pPr>
+        <w:rPr>
+          <w:rFonts w:asciiTheme="minorHAnsi" w:hAnsiTheme="minorHAnsi" w:cstheme="minorHAnsi"/>
+        </w:rPr>
+      </w:pPr>
+      <w:r>
+        <w:rPr>
+          <w:rFonts w:asciiTheme="minorHAnsi" w:hAnsiTheme="minorHAnsi" w:cstheme="minorHAnsi"/>
+        </w:rPr>
+        <w:t xml:space="preserve">The model adds the cumulative change from the valuation age to each later age to the starting rate:</w:t>
+      </w:r>
+    </w:p>
+    <w:p>
+      <w:pPr>
+        <w:spacing w:after="200"/>
+        <w:ind w:left="720"/>
+        <w:rPr>
+          <w:rFonts w:asciiTheme="minorHAnsi" w:hAnsiTheme="minorHAnsi" w:cstheme="minorHAnsi"/>
+        </w:rPr>
+      </w:pPr>
+      <w:r>
+        <w:rPr>
+          <w:rFonts w:asciiTheme="minorHAnsi" w:hAnsiTheme="minorHAnsi" w:cstheme="minorHAnsi"/>
+          <w:i/>
+        </w:rPr>
+        <w:t xml:space="preserve">rate(k) = starting rate + sum of expected changes from the valuation age to age + k</w:t>
+      </w:r>
+    </w:p>
+    <w:p>
+      <w:pPr>
+        <w:rPr>
+          <w:rFonts w:asciiTheme="minorHAnsi" w:hAnsiTheme="minorHAnsi" w:cstheme="minorHAnsi"/>
+        </w:rPr>
+      </w:pPr>
+      <w:r>
+        <w:rPr>
+          <w:rFonts w:asciiTheme="minorHAnsi" w:hAnsiTheme="minorHAnsi" w:cstheme="minorHAnsi"/>
+        </w:rPr>
+        <w:t xml:space="preserve">For Marchessault the comparables give cumulative changes of -0.280, -0.540, -0.778, and -1.181 WAR per 82 from age 34 to ages 35 through 38. His forecast rate is therefore 2.070 in 2024-25, then 1.791, 1.530, 1.292, and 0.890.</w:t>
+      </w:r>
+    </w:p>
+    <w:p>
+      <w:pPr>
+        <w:rPr>
+          <w:rFonts w:asciiTheme="minorHAnsi" w:hAnsiTheme="minorHAnsi" w:cstheme="minorHAnsi"/>
+        </w:rPr>
+      </w:pPr>
+      <w:r>
+        <w:rPr>
+          <w:rFonts w:asciiTheme="minorHAnsi" w:hAnsiTheme="minorHAnsi" w:cstheme="minorHAnsi"/>
+        </w:rPr>
+        <w:t xml:space="preserve">The changes are added in rate units rather than applied as percentages. A percentage change misbehaves when the starting level is small or negative: a 10% decline applied to minus 0.5 WAR raises the forecast toward zero. Adding the change treats a below-replacement player the same way as any other, and no floor or special rule is needed for negative starting rates. The switch from multiplying to adding was scored only as part of the package that introduced the fitted start; its effect alone has not been measured.</w:t>
+      </w:r>
+    </w:p>
+    <w:p>
+      <w:pPr>
+        <w:rPr>
+          <w:rFonts w:asciiTheme="minorHAnsi" w:hAnsiTheme="minorHAnsi" w:cstheme="minorHAnsi"/>
+        </w:rPr>
+      </w:pPr>
+      <w:r>
+        <w:rPr>
+          <w:rFonts w:asciiTheme="minorHAnsi" w:hAnsiTheme="minorHAnsi" w:cstheme="minorHAnsi"/>
+        </w:rPr>
+        <w:t xml:space="preserve">The curve module computes a starting level of its own, with the same 65/35 blend. The model does not use it: the starting rate in Section 3 counts ten-game seasons by calendar season, while the curve counts 20-game seasons by age, and the model reads only the curve’s changes, from which the curve’s own starting level cancels.</w:t>
+      </w:r>
+    </w:p>
+    <w:p>
+      <w:pPr>
+        <w:pStyle w:val="Heading2"/>
+        <w:rPr>
+          <w:rFonts w:asciiTheme="minorHAnsi" w:hAnsiTheme="minorHAnsi" w:cstheme="minorHAnsi"/>
+        </w:rPr>
+      </w:pPr>
+      <w:r>
+        <w:rPr>
+          <w:rFonts w:asciiTheme="minorHAnsi" w:hAnsiTheme="minorHAnsi" w:cstheme="minorHAnsi"/>
+        </w:rPr>
+        <w:t xml:space="preserve">Where the curve has no answer</w:t>
+      </w:r>
+    </w:p>
+    <w:p>
+      <w:pPr>
+        <w:rPr>
+          <w:rFonts w:asciiTheme="minorHAnsi" w:hAnsiTheme="minorHAnsi" w:cstheme="minorHAnsi"/>
+        </w:rPr>
+      </w:pPr>
+      <w:r>
+        <w:rPr>
+          <w:rFonts w:asciiTheme="minorHAnsi" w:hAnsiTheme="minorHAnsi" w:cstheme="minorHAnsi"/>
+        </w:rPr>
+        <w:t xml:space="preserve">Where the player has no usable profile, the model uses the league level for his position and age in place of the comparables’ level, and the league-average changes. Past the oldest age the curve covers, the rate is held at its last value. A player without a birthdate takes the league’s rate for his position in place of the comparables’ level and is carried at his starting rate with no aging; at 99.9% coverage this is rare.</w:t>
+      </w:r>
+    </w:p>
+    <w:p>
+      <w:pPr>
+        <w:pStyle w:val="Heading2"/>
+        <w:rPr>
+          <w:rFonts w:asciiTheme="minorHAnsi" w:hAnsiTheme="minorHAnsi" w:cstheme="minorHAnsi"/>
+        </w:rPr>
+      </w:pPr>
+      <w:r>
+        <w:rPr>
+          <w:rFonts w:asciiTheme="minorHAnsi" w:hAnsiTheme="minorHAnsi" w:cstheme="minorHAnsi"/>
+        </w:rPr>
+        <w:t xml:space="preserve">How well the comparables age players</w:t>
+      </w:r>
+    </w:p>
+    <w:p>
+      <w:pPr>
+        <w:rPr>
+          <w:rFonts w:asciiTheme="minorHAnsi" w:hAnsiTheme="minorHAnsi" w:cstheme="minorHAnsi"/>
+        </w:rPr>
+      </w:pPr>
+      <w:r>
+        <w:rPr>
+          <w:rFonts w:asciiTheme="minorHAnsi" w:hAnsiTheme="minorHAnsi" w:cstheme="minorHAnsi"/>
+        </w:rPr>
+        <w:t xml:space="preserve">In an earlier version of the forecast, the comparable-player curve was compared with two alternatives inside the same forecast, with every other part held fixed (development valuations 2015-2021, seasons one to five ahead). The rate error in seasons played was 1.0604 WAR per 82 with the comparables, 1.0499 with one fitted aging equation (a regression on age, position, and level), and 1.0840 with no aging at all. The fitted equation was more accurate for the typical player. The comparables were more accurate for the best players: five seasons out, players with three or more wins were under-forecast by 0.43 with the comparables and by 0.93 with the equation. In contract dollars the comparables were slightly better: their squared error was lower in 1,316 to 1,407 of 2,000 player resamples, across four pricing tables. These dollar figures were recorded before the age table’s older birthdates were restored. Stars carry the largest contracts, and the model keeps the comparables for that reason.</w:t>
+      </w:r>
+    </w:p>
+    <w:p>
+      <w:pPr>
+        <w:rPr>
+          <w:rFonts w:asciiTheme="minorHAnsi" w:hAnsiTheme="minorHAnsi" w:cstheme="minorHAnsi"/>
+        </w:rPr>
+      </w:pPr>
+      <w:r>
+        <w:rPr>
+          <w:rFonts w:asciiTheme="minorHAnsi" w:hAnsiTheme="minorHAnsi" w:cstheme="minorHAnsi"/>
+        </w:rPr>
+        <w:t xml:space="preserve">The curve’s hand-set choices were tested on held-out careers, inside the earlier version of the model. None of nineteen single changes moved average error by more than 1%. Any league weight from near zero to 20 gave the same error to within 0.06%. Weighting all same-age players equally was worse in each of four comparisons (by 0.47% to 0.94%), and halving the yardstick was slightly better in each (by 0.19% to 0.60%). Across 65 proportions of the four group weights, equal weights ranked 28th to 32nd, and no proportion moved error by more than 0.4%. The settings were not changed.</w:t>
+      </w:r>
+    </w:p>
+    <w:p>
+      <w:pPr>
+        <w:pStyle w:val="Heading1"/>
+        <w:rPr>
+          <w:rFonts w:asciiTheme="minorHAnsi" w:hAnsiTheme="minorHAnsi" w:cstheme="minorHAnsi"/>
+        </w:rPr>
+      </w:pPr>
+      <w:r>
+        <w:rPr>
+          <w:rFonts w:asciiTheme="minorHAnsi" w:hAnsiTheme="minorHAnsi" w:cstheme="minorHAnsi"/>
+        </w:rPr>
+        <w:t xml:space="preserve">5. Games Share</w:t>
+      </w:r>
+    </w:p>
+    <w:p>
+      <w:pPr>
+        <w:rPr>
+          <w:rFonts w:asciiTheme="minorHAnsi" w:hAnsiTheme="minorHAnsi" w:cstheme="minorHAnsi"/>
+        </w:rPr>
+      </w:pPr>
+      <w:r>
+        <w:rPr>
+          <w:rFonts w:asciiTheme="minorHAnsi" w:hAnsiTheme="minorHAnsi" w:cstheme="minorHAnsi"/>
+        </w:rPr>
+        <w:t xml:space="preserve">A player’s season total depends on how many games he plays as well as how well he plays in them. An earlier version of the model assumed a full season for each player. The model now forecasts the games share separately for each season ahead, with a regression refitted on each valuation date:</w:t>
+      </w:r>
+    </w:p>
+    <w:p>
+      <w:pPr>
+        <w:spacing w:after="200"/>
+        <w:ind w:left="720"/>
+        <w:rPr>
+          <w:rFonts w:asciiTheme="minorHAnsi" w:hAnsiTheme="minorHAnsi" w:cstheme="minorHAnsi"/>
+        </w:rPr>
+      </w:pPr>
+      <w:r>
+        <w:rPr>
+          <w:rFonts w:asciiTheme="minorHAnsi" w:hAnsiTheme="minorHAnsi" w:cstheme="minorHAnsi"/>
+          <w:i/>
+        </w:rPr>
+        <w:t xml:space="preserve">games share = c + d1 × trailing games share + d2 × defence + d3 × experience + d4 × (age − 27) + d5 × (age − 27)² + d6 × trailing total</w:t>
+      </w:r>
+    </w:p>
+    <w:p>
+      <w:pPr>
+        <w:rPr>
+          <w:rFonts w:asciiTheme="minorHAnsi" w:hAnsiTheme="minorHAnsi" w:cstheme="minorHAnsi"/>
+        </w:rPr>
+      </w:pPr>
+      <w:r>
+        <w:rPr>
+          <w:rFonts w:asciiTheme="minorHAnsi" w:hAnsiTheme="minorHAnsi" w:cstheme="minorHAnsi"/>
+        </w:rPr>
+        <w:t xml:space="preserve">The trailing games share and the trailing total read the same three seasons with the same 50/30/20 weights as the starting rate, without the games multiplier: a games share already counts games, and the trailing total is the weighted average of his season WAR totals rather than his rates. The level term lets a good player and a depth player with the same recent share receive different forecasts, because a club keeps playing its better players. The squared age term lets the effect of age change with age. The fit uses only seasons in which the player appeared, since the share is conditional on playing, and the forecast is held between 0.05 and 1.</w:t>
+      </w:r>
+    </w:p>
+    <w:p>
+      <w:pPr>
+        <w:rPr>
+          <w:rFonts w:asciiTheme="minorHAnsi" w:hAnsiTheme="minorHAnsi" w:cstheme="minorHAnsi"/>
+        </w:rPr>
+      </w:pPr>
+      <w:r>
+        <w:rPr>
+          <w:rFonts w:asciiTheme="minorHAnsi" w:hAnsiTheme="minorHAnsi" w:cstheme="minorHAnsi"/>
+        </w:rPr>
+        <w:t xml:space="preserve">For the 2024 valuation, the valuation-season regression is below (11,112 player-seasons from 2,094 players; standard errors clustered by player).</w:t>
       </w:r>
     </w:p>
     <w:tbl>
@@ -662,7 +1244,7 @@
                 <w:sz w:val="19"/>
                 <w:szCs w:val="19"/>
               </w:rPr>
-              <w:t xml:space="preserve">0.332</w:t>
+              <w:t xml:space="preserve">0.2023</w:t>
             </w:r>
           </w:p>
         </w:tc>
@@ -684,7 +1266,7 @@
                 <w:sz w:val="19"/>
                 <w:szCs w:val="19"/>
               </w:rPr>
-              <w:t xml:space="preserve">0.028</w:t>
+              <w:t xml:space="preserve">0.0110</w:t>
             </w:r>
           </w:p>
         </w:tc>
@@ -711,7 +1293,7 @@
                 <w:sz w:val="19"/>
                 <w:szCs w:val="19"/>
               </w:rPr>
-              <w:t xml:space="preserve">Trailing total</w:t>
+              <w:t xml:space="preserve">Trailing games share</w:t>
             </w:r>
           </w:p>
         </w:tc>
@@ -733,7 +1315,7 @@
                 <w:sz w:val="19"/>
                 <w:szCs w:val="19"/>
               </w:rPr>
-              <w:t xml:space="preserve">0.710</w:t>
+              <w:t xml:space="preserve">0.6142</w:t>
             </w:r>
           </w:p>
         </w:tc>
@@ -755,7 +1337,7 @@
                 <w:sz w:val="19"/>
                 <w:szCs w:val="19"/>
               </w:rPr>
-              <w:t xml:space="preserve">0.050</w:t>
+              <w:t xml:space="preserve">0.0136</w:t>
             </w:r>
           </w:p>
         </w:tc>
@@ -782,7 +1364,7 @@
                 <w:sz w:val="19"/>
                 <w:szCs w:val="19"/>
               </w:rPr>
-              <w:t xml:space="preserve">Trailing total above one win</w:t>
+              <w:t xml:space="preserve">Defence</w:t>
             </w:r>
           </w:p>
         </w:tc>
@@ -804,7 +1386,7 @@
                 <w:sz w:val="19"/>
                 <w:szCs w:val="19"/>
               </w:rPr>
-              <w:t xml:space="preserve">0.140</w:t>
+              <w:t xml:space="preserve">0.0075</w:t>
             </w:r>
           </w:p>
         </w:tc>
@@ -826,7 +1408,7 @@
                 <w:sz w:val="19"/>
                 <w:szCs w:val="19"/>
               </w:rPr>
-              <w:t xml:space="preserve">0.053</w:t>
+              <w:t xml:space="preserve">0.0058</w:t>
             </w:r>
           </w:p>
         </w:tc>
@@ -853,7 +1435,7 @@
                 <w:sz w:val="19"/>
                 <w:szCs w:val="19"/>
               </w:rPr>
-              <w:t xml:space="preserve">Trailing total × evidence</w:t>
+              <w:t xml:space="preserve">Experience (seasons)</w:t>
             </w:r>
           </w:p>
         </w:tc>
@@ -875,7 +1457,7 @@
                 <w:sz w:val="19"/>
                 <w:szCs w:val="19"/>
               </w:rPr>
-              <w:t xml:space="preserve">0.024</w:t>
+              <w:t xml:space="preserve">0.0048</w:t>
             </w:r>
           </w:p>
         </w:tc>
@@ -897,7 +1479,7 @@
                 <w:sz w:val="19"/>
                 <w:szCs w:val="19"/>
               </w:rPr>
-              <w:t xml:space="preserve">0.065</w:t>
+              <w:t xml:space="preserve">0.0009</w:t>
             </w:r>
           </w:p>
         </w:tc>
@@ -924,7 +1506,7 @@
                 <w:sz w:val="19"/>
                 <w:szCs w:val="19"/>
               </w:rPr>
-              <w:t xml:space="preserve">One season only</w:t>
+              <w:t xml:space="preserve">Age − 27</w:t>
             </w:r>
           </w:p>
         </w:tc>
@@ -946,7 +1528,7 @@
                 <w:sz w:val="19"/>
                 <w:szCs w:val="19"/>
               </w:rPr>
-              <w:t xml:space="preserve">-0.089</w:t>
+              <w:t xml:space="preserve">-0.0103</w:t>
             </w:r>
           </w:p>
         </w:tc>
@@ -968,7 +1550,7 @@
                 <w:sz w:val="19"/>
                 <w:szCs w:val="19"/>
               </w:rPr>
-              <w:t xml:space="preserve">0.035</w:t>
+              <w:t xml:space="preserve">0.0009</w:t>
             </w:r>
           </w:p>
         </w:tc>
@@ -995,7 +1577,7 @@
                 <w:sz w:val="19"/>
                 <w:szCs w:val="19"/>
               </w:rPr>
-              <w:t xml:space="preserve">Defence</w:t>
+              <w:t xml:space="preserve">(Age − 27)²</w:t>
             </w:r>
           </w:p>
         </w:tc>
@@ -1017,7 +1599,7 @@
                 <w:sz w:val="19"/>
                 <w:szCs w:val="19"/>
               </w:rPr>
-              <w:t xml:space="preserve">-0.146</w:t>
+              <w:t xml:space="preserve">0.0005</w:t>
             </w:r>
           </w:p>
         </w:tc>
@@ -1039,7 +1621,7 @@
                 <w:sz w:val="19"/>
                 <w:szCs w:val="19"/>
               </w:rPr>
-              <w:t xml:space="preserve">0.024</w:t>
+              <w:t xml:space="preserve">0.0001</w:t>
             </w:r>
           </w:p>
         </w:tc>
@@ -1066,7 +1648,7 @@
                 <w:sz w:val="19"/>
                 <w:szCs w:val="19"/>
               </w:rPr>
-              <w:t xml:space="preserve">Experience (seasons)</w:t>
+              <w:t xml:space="preserve">Trailing total</w:t>
             </w:r>
           </w:p>
         </w:tc>
@@ -1088,7 +1670,7 @@
                 <w:sz w:val="19"/>
                 <w:szCs w:val="19"/>
               </w:rPr>
-              <w:t xml:space="preserve">0.002</w:t>
+              <w:t xml:space="preserve">0.0399</w:t>
             </w:r>
           </w:p>
         </w:tc>
@@ -1110,149 +1692,7 @@
                 <w:sz w:val="19"/>
                 <w:szCs w:val="19"/>
               </w:rPr>
-              <w:t xml:space="preserve">0.005</w:t>
-            </w:r>
-          </w:p>
-        </w:tc>
-      </w:tr>
-      <w:tr>
-        <w:trPr>
-          <w:cantSplit/>
-        </w:trPr>
-        <w:tc>
-          <w:tcPr>
-            <w:tcW w:w="4305" w:type="dxa"/>
-          </w:tcPr>
-          <w:p>
-            <w:pPr>
-              <w:spacing w:before="20" w:after="20" w:line="240" w:lineRule="auto"/>
-              <w:jc w:val="left"/>
-              <w:rPr>
-                <w:rFonts w:asciiTheme="minorHAnsi" w:hAnsiTheme="minorHAnsi" w:cstheme="minorHAnsi"/>
-              </w:rPr>
-            </w:pPr>
-            <w:r>
-              <w:rPr>
-                <w:rFonts w:asciiTheme="minorHAnsi" w:hAnsiTheme="minorHAnsi" w:cstheme="minorHAnsi"/>
-                <w:sz w:val="19"/>
-                <w:szCs w:val="19"/>
-              </w:rPr>
-              <w:t xml:space="preserve">Age − 27</w:t>
-            </w:r>
-          </w:p>
-        </w:tc>
-        <w:tc>
-          <w:tcPr>
-            <w:tcW w:w="2527" w:type="dxa"/>
-          </w:tcPr>
-          <w:p>
-            <w:pPr>
-              <w:spacing w:before="20" w:after="20" w:line="240" w:lineRule="auto"/>
-              <w:jc w:val="right"/>
-              <w:rPr>
-                <w:rFonts w:asciiTheme="minorHAnsi" w:hAnsiTheme="minorHAnsi" w:cstheme="minorHAnsi"/>
-              </w:rPr>
-            </w:pPr>
-            <w:r>
-              <w:rPr>
-                <w:rFonts w:asciiTheme="minorHAnsi" w:hAnsiTheme="minorHAnsi" w:cstheme="minorHAnsi"/>
-                <w:sz w:val="19"/>
-                <w:szCs w:val="19"/>
-              </w:rPr>
-              <w:t xml:space="preserve">-0.055</w:t>
-            </w:r>
-          </w:p>
-        </w:tc>
-        <w:tc>
-          <w:tcPr>
-            <w:tcW w:w="2528" w:type="dxa"/>
-          </w:tcPr>
-          <w:p>
-            <w:pPr>
-              <w:spacing w:before="20" w:after="20" w:line="240" w:lineRule="auto"/>
-              <w:jc w:val="right"/>
-              <w:rPr>
-                <w:rFonts w:asciiTheme="minorHAnsi" w:hAnsiTheme="minorHAnsi" w:cstheme="minorHAnsi"/>
-              </w:rPr>
-            </w:pPr>
-            <w:r>
-              <w:rPr>
-                <w:rFonts w:asciiTheme="minorHAnsi" w:hAnsiTheme="minorHAnsi" w:cstheme="minorHAnsi"/>
-                <w:sz w:val="19"/>
-                <w:szCs w:val="19"/>
-              </w:rPr>
-              <w:t xml:space="preserve">0.005</w:t>
-            </w:r>
-          </w:p>
-        </w:tc>
-      </w:tr>
-      <w:tr>
-        <w:trPr>
-          <w:cantSplit/>
-        </w:trPr>
-        <w:tc>
-          <w:tcPr>
-            <w:tcW w:w="4305" w:type="dxa"/>
-          </w:tcPr>
-          <w:p>
-            <w:pPr>
-              <w:spacing w:before="20" w:after="20" w:line="240" w:lineRule="auto"/>
-              <w:jc w:val="left"/>
-              <w:rPr>
-                <w:rFonts w:asciiTheme="minorHAnsi" w:hAnsiTheme="minorHAnsi" w:cstheme="minorHAnsi"/>
-              </w:rPr>
-            </w:pPr>
-            <w:r>
-              <w:rPr>
-                <w:rFonts w:asciiTheme="minorHAnsi" w:hAnsiTheme="minorHAnsi" w:cstheme="minorHAnsi"/>
-                <w:sz w:val="19"/>
-                <w:szCs w:val="19"/>
-              </w:rPr>
-              <w:t xml:space="preserve">(Age − 27)²</w:t>
-            </w:r>
-          </w:p>
-        </w:tc>
-        <w:tc>
-          <w:tcPr>
-            <w:tcW w:w="2527" w:type="dxa"/>
-          </w:tcPr>
-          <w:p>
-            <w:pPr>
-              <w:spacing w:before="20" w:after="20" w:line="240" w:lineRule="auto"/>
-              <w:jc w:val="right"/>
-              <w:rPr>
-                <w:rFonts w:asciiTheme="minorHAnsi" w:hAnsiTheme="minorHAnsi" w:cstheme="minorHAnsi"/>
-              </w:rPr>
-            </w:pPr>
-            <w:r>
-              <w:rPr>
-                <w:rFonts w:asciiTheme="minorHAnsi" w:hAnsiTheme="minorHAnsi" w:cstheme="minorHAnsi"/>
-                <w:sz w:val="19"/>
-                <w:szCs w:val="19"/>
-              </w:rPr>
-              <w:t xml:space="preserve">0.0020</w:t>
-            </w:r>
-          </w:p>
-        </w:tc>
-        <w:tc>
-          <w:tcPr>
-            <w:tcW w:w="2528" w:type="dxa"/>
-          </w:tcPr>
-          <w:p>
-            <w:pPr>
-              <w:spacing w:before="20" w:after="20" w:line="240" w:lineRule="auto"/>
-              <w:jc w:val="right"/>
-              <w:rPr>
-                <w:rFonts w:asciiTheme="minorHAnsi" w:hAnsiTheme="minorHAnsi" w:cstheme="minorHAnsi"/>
-              </w:rPr>
-            </w:pPr>
-            <w:r>
-              <w:rPr>
-                <w:rFonts w:asciiTheme="minorHAnsi" w:hAnsiTheme="minorHAnsi" w:cstheme="minorHAnsi"/>
-                <w:sz w:val="19"/>
-                <w:szCs w:val="19"/>
-              </w:rPr>
-              <w:t xml:space="preserve">0.0005</w:t>
+              <w:t xml:space="preserve">0.0026</w:t>
             </w:r>
           </w:p>
         </w:tc>
@@ -1273,59 +1713,20 @@
         <w:rPr>
           <w:rFonts w:asciiTheme="minorHAnsi" w:hAnsiTheme="minorHAnsi" w:cstheme="minorHAnsi"/>
         </w:rPr>
-        <w:t xml:space="preserve">The fit uses 11,112 player-seasons from 2,094 players, seasons 2008-09 through 2023-24, and explains 40% of the games-weighted variation in the rate.</w:t>
-      </w:r>
-    </w:p>
-    <w:p>
-      <w:pPr>
-        <w:rPr>
-          <w:rFonts w:asciiTheme="minorHAnsi" w:hAnsiTheme="minorHAnsi" w:cstheme="minorHAnsi"/>
-        </w:rPr>
-      </w:pPr>
-      <w:r>
-        <w:rPr>
-          <w:rFonts w:asciiTheme="minorHAnsi" w:hAnsiTheme="minorHAnsi" w:cstheme="minorHAnsi"/>
-        </w:rPr>
-        <w:t xml:space="preserve">The coefficient on the trailing total is the pull toward typical. Take a forward of 27 with five seasons of experience and three full seasons behind his trailing total. At two trailing wins he starts at about 1.95 WAR per 82 games, at four wins about 3.69, and at minus 0.5 about 0.0. The slope is steeper above one win, so good players keep more of their level than average ones, while players below replacement are pulled most of the way back to zero. Age lowers the start by about 0.055 WAR per year past 27, which is a level effect at the valuation date; the change in ability over the following seasons comes from the aging curve in Section 4.</w:t>
-      </w:r>
-    </w:p>
-    <w:p>
-      <w:pPr>
-        <w:rPr>
-          <w:rFonts w:asciiTheme="minorHAnsi" w:hAnsiTheme="minorHAnsi" w:cstheme="minorHAnsi"/>
-        </w:rPr>
-      </w:pPr>
-      <w:r>
-        <w:rPr>
-          <w:rFonts w:asciiTheme="minorHAnsi" w:hAnsiTheme="minorHAnsi" w:cstheme="minorHAnsi"/>
-        </w:rPr>
-        <w:t xml:space="preserve">For Marchessault, aged 34 in 2024-25 with 11 seasons of experience and a trailing total of 2.81 built on about 79 games of evidence, the fitted start is 2.37 WAR per 82 games. The age terms take 0.29 off what a 27-year-old with the same record would receive.</w:t>
-      </w:r>
-    </w:p>
-    <w:p>
-      <w:pPr>
-        <w:rPr>
-          <w:rFonts w:asciiTheme="minorHAnsi" w:hAnsiTheme="minorHAnsi" w:cstheme="minorHAnsi"/>
-        </w:rPr>
-      </w:pPr>
-      <w:r>
-        <w:rPr>
-          <w:rFonts w:asciiTheme="minorHAnsi" w:hAnsiTheme="minorHAnsi" w:cstheme="minorHAnsi"/>
-        </w:rPr>
-        <w:t xml:space="preserve">The pull is one of the largest single gains in the model. In the development tests, with the other parts of the forecast held fixed, replacing a plain three-season average with the fitted start lowered season-WAR error (root mean squared error, RMSE) from 0.882 to 0.862, a 2.3% reduction. It also removed most of the tilt by quality in the valuation season. The bias for three-win players went from +0.43 to -0.19, and for players below zero from -0.18 to +0.01.</w:t>
-      </w:r>
-    </w:p>
-    <w:p>
-      <w:pPr>
-        <w:rPr>
-          <w:rFonts w:asciiTheme="minorHAnsi" w:hAnsiTheme="minorHAnsi" w:cstheme="minorHAnsi"/>
-        </w:rPr>
-      </w:pPr>
-      <w:r>
-        <w:rPr>
-          <w:rFonts w:asciiTheme="minorHAnsi" w:hAnsiTheme="minorHAnsi" w:cstheme="minorHAnsi"/>
-        </w:rPr>
-        <w:t xml:space="preserve">The best players are still under-forecast. Over the first five forecast seasons, players with three or more trailing wins are under-forecast by 0.26 WAR a season (95% interval -0.56 to +0.08; recorded before the age table’s older birthdates were restored). Five players carry most of this: Connor McDavid, Leon Draisaitl, Nathan MacKinnon, Auston Matthews, and Sidney Crosby. Without them the group is unbiased. Which step causes the miss has not been established.</w:t>
+        <w:t xml:space="preserve">Recent availability carries most of the signal, and it says less about the more distant future: the weight on the trailing share falls from 0.61 in the valuation season to 0.27 five seasons out. A trailing win adds 0.04 to the share. The regression explains 30% of the variation in the valuation season’s share. Marchessault’s forecast share is 0.914 in 2024-25, about 75 games.</w:t>
+      </w:r>
+    </w:p>
+    <w:p>
+      <w:pPr>
+        <w:rPr>
+          <w:rFonts w:asciiTheme="minorHAnsi" w:hAnsiTheme="minorHAnsi" w:cstheme="minorHAnsi"/>
+        </w:rPr>
+      </w:pPr>
+      <w:r>
+        <w:rPr>
+          <w:rFonts w:asciiTheme="minorHAnsi" w:hAnsiTheme="minorHAnsi" w:cstheme="minorHAnsi"/>
+        </w:rPr>
+        <w:t xml:space="preserve">Three choices in this equation were tested on the development valuations, scored on season WAR, the quantity the forecast prices. Reading the trailing WAR total rather than a trailing rate per 82 gave a season-WAR RMSE of 0.8093 against 0.8108; the rate was better in only 10 of 2,000 career resamples, although it fitted the share itself slightly better. A second level term, letting the slope change above one win, improved the share but raised season-WAR error (0.8107 against 0.8093) and was dropped. The squared age term lowered season-WAR error from 0.8088 to 0.8078, lower in 1,982 of 2,000 resamples. A logistic form fitted the share better but raised season-WAR error to 0.8108 and was not adopted.</w:t>
       </w:r>
     </w:p>
     <w:p>
@@ -1339,20 +1740,20 @@
         <w:rPr>
           <w:rFonts w:asciiTheme="minorHAnsi" w:hAnsiTheme="minorHAnsi" w:cstheme="minorHAnsi"/>
         </w:rPr>
-        <w:t xml:space="preserve">4. How the Rate Changes with Age</w:t>
-      </w:r>
-    </w:p>
-    <w:p>
-      <w:pPr>
-        <w:rPr>
-          <w:rFonts w:asciiTheme="minorHAnsi" w:hAnsiTheme="minorHAnsi" w:cstheme="minorHAnsi"/>
-        </w:rPr>
-      </w:pPr>
-      <w:r>
-        <w:rPr>
-          <w:rFonts w:asciiTheme="minorHAnsi" w:hAnsiTheme="minorHAnsi" w:cstheme="minorHAnsi"/>
-        </w:rPr>
-        <w:t xml:space="preserve">The starting rate describes the valuation season. A contract also runs through later seasons in which the player will be older, and production changes with age at different speeds for different kinds of players. The model estimates those changes from the later careers of players who resembled him at the same age. It then adds the changes to his starting rate.</w:t>
+        <w:t xml:space="preserve">6. The Chance of Playing</w:t>
+      </w:r>
+    </w:p>
+    <w:p>
+      <w:pPr>
+        <w:rPr>
+          <w:rFonts w:asciiTheme="minorHAnsi" w:hAnsiTheme="minorHAnsi" w:cstheme="minorHAnsi"/>
+        </w:rPr>
+      </w:pPr>
+      <w:r>
+        <w:rPr>
+          <w:rFonts w:asciiTheme="minorHAnsi" w:hAnsiTheme="minorHAnsi" w:cstheme="minorHAnsi"/>
+        </w:rPr>
+        <w:t xml:space="preserve">There is always a risk that a player does not play a season his contract covers: he may retire, be injured for the full season, be loaned to another league, or be unable to keep an NHL job. The chance of playing is the probability that he appears in at least one NHL game in a given season. The rate and the games share are forecast for the same event, a season in which he plays. The product in Section 2 is therefore an expectation of one quantity.</w:t>
       </w:r>
     </w:p>
     <w:p>
@@ -1366,1082 +1767,6 @@
         <w:rPr>
           <w:rFonts w:asciiTheme="minorHAnsi" w:hAnsiTheme="minorHAnsi" w:cstheme="minorHAnsi"/>
         </w:rPr>
-        <w:t xml:space="preserve">Describing the player at his last observed age</w:t>
-      </w:r>
-    </w:p>
-    <w:p>
-      <w:pPr>
-        <w:rPr>
-          <w:rFonts w:asciiTheme="minorHAnsi" w:hAnsiTheme="minorHAnsi" w:cstheme="minorHAnsi"/>
-        </w:rPr>
-      </w:pPr>
-      <w:r>
-        <w:rPr>
-          <w:rFonts w:asciiTheme="minorHAnsi" w:hAnsiTheme="minorHAnsi" w:cstheme="minorHAnsi"/>
-        </w:rPr>
-        <w:t xml:space="preserve">The model describes the player at his last season before the valuation date. For a valuation in 2024-25, that is his age in 2023-24. If that season is unusable for the aging data, it tries the season before. The aging data require at least 20 games in a season, against ten for the trailing total. Twenty games is the curve’s eligibility threshold, with no claim that it is the best possible cutoff.</w:t>
-      </w:r>
-    </w:p>
-    <w:p>
-      <w:pPr>
-        <w:rPr>
-          <w:rFonts w:asciiTheme="minorHAnsi" w:hAnsiTheme="minorHAnsi" w:cstheme="minorHAnsi"/>
-        </w:rPr>
-      </w:pPr>
-      <w:r>
-        <w:rPr>
-          <w:rFonts w:asciiTheme="minorHAnsi" w:hAnsiTheme="minorHAnsi" w:cstheme="minorHAnsi"/>
-        </w:rPr>
-        <w:t xml:space="preserve">The description, called a profile, contains eight measures. Five describe playing style: the shares of his WAR that came from even-strength offence, even-strength defence, the power play, the penalty kill, and shooting. The other three are ice time per game, his recent rate (the average of his rates over his last two qualifying seasons, or the last season alone if the one before it is not the previous year), and his trend (the change between those two seasons, or zero with one season). Each measure is put on a common scale within position, so that minutes do not dominate wins because their numbers are larger.</w:t>
-      </w:r>
-    </w:p>
-    <w:p>
-      <w:pPr>
-        <w:pStyle w:val="Heading2"/>
-        <w:rPr>
-          <w:rFonts w:asciiTheme="minorHAnsi" w:hAnsiTheme="minorHAnsi" w:cstheme="minorHAnsi"/>
-        </w:rPr>
-      </w:pPr>
-      <w:r>
-        <w:rPr>
-          <w:rFonts w:asciiTheme="minorHAnsi" w:hAnsiTheme="minorHAnsi" w:cstheme="minorHAnsi"/>
-        </w:rPr>
-        <w:t xml:space="preserve">Weighting the comparables</w:t>
-      </w:r>
-    </w:p>
-    <w:p>
-      <w:pPr>
-        <w:rPr>
-          <w:rFonts w:asciiTheme="minorHAnsi" w:hAnsiTheme="minorHAnsi" w:cstheme="minorHAnsi"/>
-        </w:rPr>
-      </w:pPr>
-      <w:r>
-        <w:rPr>
-          <w:rFonts w:asciiTheme="minorHAnsi" w:hAnsiTheme="minorHAnsi" w:cstheme="minorHAnsi"/>
-        </w:rPr>
-        <w:t xml:space="preserve">The comparables are the historical profiles of players at the same age and position. Each player contributes one profile for each pair of consecutive 20-game seasons in his career, and the player being valued is excluded from his own comparables.</w:t>
-      </w:r>
-    </w:p>
-    <w:p>
-      <w:pPr>
-        <w:rPr>
-          <w:rFonts w:asciiTheme="minorHAnsi" w:hAnsiTheme="minorHAnsi" w:cstheme="minorHAnsi"/>
-        </w:rPr>
-      </w:pPr>
-      <w:r>
-        <w:rPr>
-          <w:rFonts w:asciiTheme="minorHAnsi" w:hAnsiTheme="minorHAnsi" w:cstheme="minorHAnsi"/>
-        </w:rPr>
-        <w:t xml:space="preserve">The model measures the distance between the player’s profile and each comparable’s, then turns the distance into a weight:</w:t>
-      </w:r>
-    </w:p>
-    <w:p>
-      <w:pPr>
-        <w:spacing w:after="200"/>
-        <w:ind w:left="720"/>
-        <w:rPr>
-          <w:rFonts w:asciiTheme="minorHAnsi" w:hAnsiTheme="minorHAnsi" w:cstheme="minorHAnsi"/>
-        </w:rPr>
-      </w:pPr>
-      <w:r>
-        <w:rPr>
-          <w:rFonts w:asciiTheme="minorHAnsi" w:hAnsiTheme="minorHAnsi" w:cstheme="minorHAnsi"/>
-          <w:i/>
-        </w:rPr>
-        <w:t xml:space="preserve">weight = exp(−distance² / (2 × yardstick²))</w:t>
-      </w:r>
-    </w:p>
-    <w:p>
-      <w:pPr>
-        <w:rPr>
-          <w:rFonts w:asciiTheme="minorHAnsi" w:hAnsiTheme="minorHAnsi" w:cstheme="minorHAnsi"/>
-        </w:rPr>
-      </w:pPr>
-      <w:r>
-        <w:rPr>
-          <w:rFonts w:asciiTheme="minorHAnsi" w:hAnsiTheme="minorHAnsi" w:cstheme="minorHAnsi"/>
-        </w:rPr>
-        <w:t xml:space="preserve">The four groups of measures (style, ice time, recent rate, and trend) receive equal weight in the distance. The five style measures share one group’s weight. The yardstick sets how quickly weight falls with distance. It is the median distance between sampled pairs of profiles within each position, pooled across the two positions. An exact match receives a weight of 1, a comparable one yardstick away about 0.61, and one twice as far about 0.14. There is no fixed number of comparables; each eligible profile counts in proportion to its weight. This form, a Gaussian kernel, is standard in nonparametric regression [ref needed: a kernel-weighted nearest-neighbour reference].</w:t>
-      </w:r>
-    </w:p>
-    <w:p>
-      <w:pPr>
-        <w:pStyle w:val="Heading2"/>
-        <w:rPr>
-          <w:rFonts w:asciiTheme="minorHAnsi" w:hAnsiTheme="minorHAnsi" w:cstheme="minorHAnsi"/>
-        </w:rPr>
-      </w:pPr>
-      <w:r>
-        <w:rPr>
-          <w:rFonts w:asciiTheme="minorHAnsi" w:hAnsiTheme="minorHAnsi" w:cstheme="minorHAnsi"/>
-        </w:rPr>
-        <w:t xml:space="preserve">Stabilizing the estimate with the league average</w:t>
-      </w:r>
-    </w:p>
-    <w:p>
-      <w:pPr>
-        <w:rPr>
-          <w:rFonts w:asciiTheme="minorHAnsi" w:hAnsiTheme="minorHAnsi" w:cstheme="minorHAnsi"/>
-        </w:rPr>
-      </w:pPr>
-      <w:r>
-        <w:rPr>
-          <w:rFonts w:asciiTheme="minorHAnsi" w:hAnsiTheme="minorHAnsi" w:cstheme="minorHAnsi"/>
-        </w:rPr>
-        <w:t xml:space="preserve">A small or poorly matched group of comparables could produce an extreme estimate on its own. To guard against that, the model mixes the comparables’ average with the league average for the same position and age. The league average counts as ten units of weight, and the comparables count as the sum of the weights of those who have a value at that age. When the comparables are many and close, their weights sum well above ten and they dominate; when they are few or distant, the league average takes over. For example, if the comparables’ weights sum to 20, they carry two-thirds of the estimate.</w:t>
-      </w:r>
-    </w:p>
-    <w:p>
-      <w:pPr>
-        <w:pStyle w:val="Heading2"/>
-        <w:rPr>
-          <w:rFonts w:asciiTheme="minorHAnsi" w:hAnsiTheme="minorHAnsi" w:cstheme="minorHAnsi"/>
-        </w:rPr>
-      </w:pPr>
-      <w:r>
-        <w:rPr>
-          <w:rFonts w:asciiTheme="minorHAnsi" w:hAnsiTheme="minorHAnsi" w:cstheme="minorHAnsi"/>
-        </w:rPr>
-        <w:t xml:space="preserve">Measuring change within players, departures included</w:t>
-      </w:r>
-    </w:p>
-    <w:p>
-      <w:pPr>
-        <w:rPr>
-          <w:rFonts w:asciiTheme="minorHAnsi" w:hAnsiTheme="minorHAnsi" w:cstheme="minorHAnsi"/>
-        </w:rPr>
-      </w:pPr>
-      <w:r>
-        <w:rPr>
-          <w:rFonts w:asciiTheme="minorHAnsi" w:hAnsiTheme="minorHAnsi" w:cstheme="minorHAnsi"/>
-        </w:rPr>
-        <w:t xml:space="preserve">For each comparable, the model measures the change in his recent rate from one age to the next. If a comparable’s rate fell from 2.2 at age 33 to 2.0 at age 34, his change is minus 0.2. The weighted average of these changes, mixed with the league-average change, is the player’s expected change at that age. The comparables chosen at the last observed age stay fixed as the projection moves to later ages; each later step asks how those same players changed next.</w:t>
-      </w:r>
-    </w:p>
-    <w:p>
-      <w:pPr>
-        <w:rPr>
-          <w:rFonts w:asciiTheme="minorHAnsi" w:hAnsiTheme="minorHAnsi" w:cstheme="minorHAnsi"/>
-        </w:rPr>
-      </w:pPr>
-      <w:r>
-        <w:rPr>
-          <w:rFonts w:asciiTheme="minorHAnsi" w:hAnsiTheme="minorHAnsi" w:cstheme="minorHAnsi"/>
-        </w:rPr>
-        <w:t xml:space="preserve">Measuring change within players compares each player with himself a year later. Comparing separate groups of 33-year-olds and 34-year-olds would give a different and misleading answer, because weaker players leave between those ages.</w:t>
-      </w:r>
-    </w:p>
-    <w:p>
-      <w:pPr>
-        <w:rPr>
-          <w:rFonts w:asciiTheme="minorHAnsi" w:hAnsiTheme="minorHAnsi" w:cstheme="minorHAnsi"/>
-        </w:rPr>
-      </w:pPr>
-      <w:r>
-        <w:rPr>
-          <w:rFonts w:asciiTheme="minorHAnsi" w:hAnsiTheme="minorHAnsi" w:cstheme="minorHAnsi"/>
-        </w:rPr>
-        <w:t xml:space="preserve">Measuring within players does not solve the problem completely, because a player who leaves the league never records the season in which he would have declined. The aging curve would then describe only the players who kept their jobs. To correct for this, a comparable who played a season and has no NHL record of any kind the next season is entered as if he had played that next season at replacement level, which is zero on the WAR scale. His imputed change is computed the way the curve smooths every other season, by averaging that zero with his last rate. The league-average changes are recomputed with these imputed departures included. Only departures whose next season had finished before the valuation date are imputed. On the 2024 valuation, 1,071 departures enter the curve this way.</w:t>
-      </w:r>
-    </w:p>
-    <w:p>
-      <w:pPr>
-        <w:rPr>
-          <w:rFonts w:asciiTheme="minorHAnsi" w:hAnsiTheme="minorHAnsi" w:cstheme="minorHAnsi"/>
-        </w:rPr>
-      </w:pPr>
-      <w:r>
-        <w:rPr>
-          <w:rFonts w:asciiTheme="minorHAnsi" w:hAnsiTheme="minorHAnsi" w:cstheme="minorHAnsi"/>
-        </w:rPr>
-        <w:t xml:space="preserve">Replacement level is an identifying assumption, not a measurement. Some departing players were injured and would have been above replacement, so the imputation is better read as a bound on decline than as a point estimate. In the development tests it made little difference to accuracy: season-WAR RMSE moved from 0.8621 to 0.8619.</w:t>
-      </w:r>
-    </w:p>
-    <w:p>
-      <w:pPr>
-        <w:pStyle w:val="Heading2"/>
-        <w:rPr>
-          <w:rFonts w:asciiTheme="minorHAnsi" w:hAnsiTheme="minorHAnsi" w:cstheme="minorHAnsi"/>
-        </w:rPr>
-      </w:pPr>
-      <w:r>
-        <w:rPr>
-          <w:rFonts w:asciiTheme="minorHAnsi" w:hAnsiTheme="minorHAnsi" w:cstheme="minorHAnsi"/>
-        </w:rPr>
-        <w:t xml:space="preserve">Adding the changes to the starting rate</w:t>
-      </w:r>
-    </w:p>
-    <w:p>
-      <w:pPr>
-        <w:rPr>
-          <w:rFonts w:asciiTheme="minorHAnsi" w:hAnsiTheme="minorHAnsi" w:cstheme="minorHAnsi"/>
-        </w:rPr>
-      </w:pPr>
-      <w:r>
-        <w:rPr>
-          <w:rFonts w:asciiTheme="minorHAnsi" w:hAnsiTheme="minorHAnsi" w:cstheme="minorHAnsi"/>
-        </w:rPr>
-        <w:t xml:space="preserve">The model adds the cumulative change from the valuation age to each later age to the starting rate:</w:t>
-      </w:r>
-    </w:p>
-    <w:p>
-      <w:pPr>
-        <w:spacing w:after="200"/>
-        <w:ind w:left="720"/>
-        <w:rPr>
-          <w:rFonts w:asciiTheme="minorHAnsi" w:hAnsiTheme="minorHAnsi" w:cstheme="minorHAnsi"/>
-        </w:rPr>
-      </w:pPr>
-      <w:r>
-        <w:rPr>
-          <w:rFonts w:asciiTheme="minorHAnsi" w:hAnsiTheme="minorHAnsi" w:cstheme="minorHAnsi"/>
-          <w:i/>
-        </w:rPr>
-        <w:t xml:space="preserve">rate(k) = starting rate + sum of expected changes from the valuation age to age + k</w:t>
-      </w:r>
-    </w:p>
-    <w:p>
-      <w:pPr>
-        <w:rPr>
-          <w:rFonts w:asciiTheme="minorHAnsi" w:hAnsiTheme="minorHAnsi" w:cstheme="minorHAnsi"/>
-        </w:rPr>
-      </w:pPr>
-      <w:r>
-        <w:rPr>
-          <w:rFonts w:asciiTheme="minorHAnsi" w:hAnsiTheme="minorHAnsi" w:cstheme="minorHAnsi"/>
-        </w:rPr>
-        <w:t xml:space="preserve">For Marchessault the comparables give cumulative changes of -0.37, -0.60, -0.81, and -1.25 WAR per 82 games from age 34 to ages 35 through 38. His forecast rate is therefore 2.37 in 2024-25, then 2.00, 1.76, 1.56, and 1.12.</w:t>
-      </w:r>
-    </w:p>
-    <w:p>
-      <w:pPr>
-        <w:rPr>
-          <w:rFonts w:asciiTheme="minorHAnsi" w:hAnsiTheme="minorHAnsi" w:cstheme="minorHAnsi"/>
-        </w:rPr>
-      </w:pPr>
-      <w:r>
-        <w:rPr>
-          <w:rFonts w:asciiTheme="minorHAnsi" w:hAnsiTheme="minorHAnsi" w:cstheme="minorHAnsi"/>
-        </w:rPr>
-        <w:t xml:space="preserve">The changes are added in rate units rather than applied as percentages. A percentage change misbehaves when the starting level is small or negative: a 10% decline applied to minus 0.5 WAR raises the forecast toward zero. Adding the change treats a below-replacement player the same way as any other, and no floor or special rule is needed for negative starting rates. The switch from multiplying to adding was scored only as part of the package that introduced the fitted start; its effect alone has not been measured.</w:t>
-      </w:r>
-    </w:p>
-    <w:p>
-      <w:pPr>
-        <w:rPr>
-          <w:rFonts w:asciiTheme="minorHAnsi" w:hAnsiTheme="minorHAnsi" w:cstheme="minorHAnsi"/>
-        </w:rPr>
-      </w:pPr>
-      <w:r>
-        <w:rPr>
-          <w:rFonts w:asciiTheme="minorHAnsi" w:hAnsiTheme="minorHAnsi" w:cstheme="minorHAnsi"/>
-        </w:rPr>
-        <w:t xml:space="preserve">The aging curve module also computes a starting level of its own, which blends the player’s recent rate (55%) with the comparables’ level (45%). This model does not use that level. It reads only the curve’s changes, from which the 55/45 starting level cancels, so the 55/45 weight has no effect on any value the model produces.</w:t>
-      </w:r>
-    </w:p>
-    <w:p>
-      <w:pPr>
-        <w:pStyle w:val="Heading2"/>
-        <w:rPr>
-          <w:rFonts w:asciiTheme="minorHAnsi" w:hAnsiTheme="minorHAnsi" w:cstheme="minorHAnsi"/>
-        </w:rPr>
-      </w:pPr>
-      <w:r>
-        <w:rPr>
-          <w:rFonts w:asciiTheme="minorHAnsi" w:hAnsiTheme="minorHAnsi" w:cstheme="minorHAnsi"/>
-        </w:rPr>
-        <w:t xml:space="preserve">Where the curve has no answer</w:t>
-      </w:r>
-    </w:p>
-    <w:p>
-      <w:pPr>
-        <w:rPr>
-          <w:rFonts w:asciiTheme="minorHAnsi" w:hAnsiTheme="minorHAnsi" w:cstheme="minorHAnsi"/>
-        </w:rPr>
-      </w:pPr>
-      <w:r>
-        <w:rPr>
-          <w:rFonts w:asciiTheme="minorHAnsi" w:hAnsiTheme="minorHAnsi" w:cstheme="minorHAnsi"/>
-        </w:rPr>
-        <w:t xml:space="preserve">Where the player has no usable profile, the model uses the league-average changes for his position and age. Past the oldest age the curve covers, the rate is held at its last value. A player without a birthdate is carried at his starting rate with no aging; at 99.9% coverage this is rare.</w:t>
-      </w:r>
-    </w:p>
-    <w:p>
-      <w:pPr>
-        <w:pStyle w:val="Heading2"/>
-        <w:rPr>
-          <w:rFonts w:asciiTheme="minorHAnsi" w:hAnsiTheme="minorHAnsi" w:cstheme="minorHAnsi"/>
-        </w:rPr>
-      </w:pPr>
-      <w:r>
-        <w:rPr>
-          <w:rFonts w:asciiTheme="minorHAnsi" w:hAnsiTheme="minorHAnsi" w:cstheme="minorHAnsi"/>
-        </w:rPr>
-        <w:t xml:space="preserve">How well the comparables age players</w:t>
-      </w:r>
-    </w:p>
-    <w:p>
-      <w:pPr>
-        <w:rPr>
-          <w:rFonts w:asciiTheme="minorHAnsi" w:hAnsiTheme="minorHAnsi" w:cstheme="minorHAnsi"/>
-        </w:rPr>
-      </w:pPr>
-      <w:r>
-        <w:rPr>
-          <w:rFonts w:asciiTheme="minorHAnsi" w:hAnsiTheme="minorHAnsi" w:cstheme="minorHAnsi"/>
-        </w:rPr>
-        <w:t xml:space="preserve">The comparable-player curve was compared with two alternatives inside the same forecast, with every other part held fixed (development valuations 2015-2021, seasons one to five ahead). The rate error in seasons played was 1.0604 WAR per 82 with the comparables, 1.0499 with one fitted aging equation (a regression on age, position, and level), and 1.0840 with no aging at all. The fitted equation was more accurate for the typical player. The comparables were more accurate for the best players: five seasons out, players with three or more wins were under-forecast by 0.43 with the comparables and by 0.93 with the equation. In contract dollars the comparables were slightly better: their squared error was lower in 1,316 to 1,407 of 2,000 player resamples, across four pricing tables. These dollar figures were recorded before the age table’s older birthdates were restored. Stars carry the largest contracts, and the model keeps the comparables for that reason.</w:t>
-      </w:r>
-    </w:p>
-    <w:p>
-      <w:pPr>
-        <w:rPr>
-          <w:rFonts w:asciiTheme="minorHAnsi" w:hAnsiTheme="minorHAnsi" w:cstheme="minorHAnsi"/>
-        </w:rPr>
-      </w:pPr>
-      <w:r>
-        <w:rPr>
-          <w:rFonts w:asciiTheme="minorHAnsi" w:hAnsiTheme="minorHAnsi" w:cstheme="minorHAnsi"/>
-        </w:rPr>
-        <w:t xml:space="preserve">The curve’s hand-set choices were tested on held-out careers, inside the earlier version of the model. None of nineteen single changes moved average error by more than 1%. Any league weight from near zero to 20 gave the same error to within 0.06%. Weighting all same-age players equally was worse in each of four comparisons (by 0.47% to 0.94%), and halving the yardstick was slightly better in each (by 0.19% to 0.60%). Across 65 proportions of the four group weights, equal weights ranked 28th to 32nd, and no proportion moved error by more than 0.4%. The settings were not changed.</w:t>
-      </w:r>
-    </w:p>
-    <w:p>
-      <w:pPr>
-        <w:pStyle w:val="Heading1"/>
-        <w:rPr>
-          <w:rFonts w:asciiTheme="minorHAnsi" w:hAnsiTheme="minorHAnsi" w:cstheme="minorHAnsi"/>
-        </w:rPr>
-      </w:pPr>
-      <w:r>
-        <w:rPr>
-          <w:rFonts w:asciiTheme="minorHAnsi" w:hAnsiTheme="minorHAnsi" w:cstheme="minorHAnsi"/>
-        </w:rPr>
-        <w:t xml:space="preserve">5. Games Share</w:t>
-      </w:r>
-    </w:p>
-    <w:p>
-      <w:pPr>
-        <w:rPr>
-          <w:rFonts w:asciiTheme="minorHAnsi" w:hAnsiTheme="minorHAnsi" w:cstheme="minorHAnsi"/>
-        </w:rPr>
-      </w:pPr>
-      <w:r>
-        <w:rPr>
-          <w:rFonts w:asciiTheme="minorHAnsi" w:hAnsiTheme="minorHAnsi" w:cstheme="minorHAnsi"/>
-        </w:rPr>
-        <w:t xml:space="preserve">A player’s season total depends on how many games he plays as well as how well he plays in them. An earlier version of the model assumed a full season for each player. The model now forecasts the games share separately for each season ahead, with a regression refitted on each valuation date:</w:t>
-      </w:r>
-    </w:p>
-    <w:p>
-      <w:pPr>
-        <w:spacing w:after="200"/>
-        <w:ind w:left="720"/>
-        <w:rPr>
-          <w:rFonts w:asciiTheme="minorHAnsi" w:hAnsiTheme="minorHAnsi" w:cstheme="minorHAnsi"/>
-        </w:rPr>
-      </w:pPr>
-      <w:r>
-        <w:rPr>
-          <w:rFonts w:asciiTheme="minorHAnsi" w:hAnsiTheme="minorHAnsi" w:cstheme="minorHAnsi"/>
-          <w:i/>
-        </w:rPr>
-        <w:t xml:space="preserve">games share = c + d1 × trailing games share + d2 × defence + d3 × experience + d4 × (age − 27) + d5 × trailing total + d6 × max(trailing total − 1, 0)</w:t>
-      </w:r>
-    </w:p>
-    <w:p>
-      <w:pPr>
-        <w:rPr>
-          <w:rFonts w:asciiTheme="minorHAnsi" w:hAnsiTheme="minorHAnsi" w:cstheme="minorHAnsi"/>
-        </w:rPr>
-      </w:pPr>
-      <w:r>
-        <w:rPr>
-          <w:rFonts w:asciiTheme="minorHAnsi" w:hAnsiTheme="minorHAnsi" w:cstheme="minorHAnsi"/>
-        </w:rPr>
-        <w:t xml:space="preserve">The trailing games share uses the same three-season weights as the trailing total. The level terms let a good player and a depth player with the same recent share receive different forecasts, because a club keeps playing its better players. The fit uses only seasons in which the player appeared, since the share is conditional on playing, and the forecast is held between 0.05 and 1.</w:t>
-      </w:r>
-    </w:p>
-    <w:p>
-      <w:pPr>
-        <w:rPr>
-          <w:rFonts w:asciiTheme="minorHAnsi" w:hAnsiTheme="minorHAnsi" w:cstheme="minorHAnsi"/>
-        </w:rPr>
-      </w:pPr>
-      <w:r>
-        <w:rPr>
-          <w:rFonts w:asciiTheme="minorHAnsi" w:hAnsiTheme="minorHAnsi" w:cstheme="minorHAnsi"/>
-        </w:rPr>
-        <w:t xml:space="preserve">For the 2024 valuation, the valuation-season regression is below (11,112 player-seasons; standard errors clustered by player).</w:t>
-      </w:r>
-    </w:p>
-    <w:tbl>
-      <w:tblPr>
-        <w:tblW w:w="9360" w:type="dxa"/>
-        <w:tblBorders>
-          <w:top w:val="single" w:sz="4" w:space="0" w:color="A6A6A6"/>
-          <w:left w:val="single" w:sz="4" w:space="0" w:color="A6A6A6"/>
-          <w:bottom w:val="single" w:sz="4" w:space="0" w:color="A6A6A6"/>
-          <w:right w:val="single" w:sz="4" w:space="0" w:color="A6A6A6"/>
-          <w:insideH w:val="single" w:sz="4" w:space="0" w:color="A6A6A6"/>
-          <w:insideV w:val="single" w:sz="4" w:space="0" w:color="A6A6A6"/>
-        </w:tblBorders>
-        <w:tblLayout w:type="fixed"/>
-        <w:tblCellMar>
-          <w:left w:w="80" w:type="dxa"/>
-          <w:right w:w="80" w:type="dxa"/>
-        </w:tblCellMar>
-      </w:tblPr>
-      <w:tblGrid>
-        <w:gridCol w:w="4305"/>
-        <w:gridCol w:w="2527"/>
-        <w:gridCol w:w="2528"/>
-      </w:tblGrid>
-      <w:tr>
-        <w:trPr>
-          <w:tblHeader/>
-          <w:cantSplit/>
-        </w:trPr>
-        <w:tc>
-          <w:tcPr>
-            <w:tcW w:w="4305" w:type="dxa"/>
-            <w:shd w:val="clear" w:color="auto" w:fill="E7E6E6"/>
-          </w:tcPr>
-          <w:p>
-            <w:pPr>
-              <w:spacing w:before="20" w:after="20" w:line="240" w:lineRule="auto"/>
-              <w:jc w:val="left"/>
-              <w:rPr>
-                <w:rFonts w:asciiTheme="minorHAnsi" w:hAnsiTheme="minorHAnsi" w:cstheme="minorHAnsi"/>
-              </w:rPr>
-            </w:pPr>
-            <w:r>
-              <w:rPr>
-                <w:rFonts w:asciiTheme="minorHAnsi" w:hAnsiTheme="minorHAnsi" w:cstheme="minorHAnsi"/>
-                <w:b/>
-                <w:sz w:val="19"/>
-                <w:szCs w:val="19"/>
-              </w:rPr>
-              <w:t xml:space="preserve">Term</w:t>
-            </w:r>
-          </w:p>
-        </w:tc>
-        <w:tc>
-          <w:tcPr>
-            <w:tcW w:w="2527" w:type="dxa"/>
-            <w:shd w:val="clear" w:color="auto" w:fill="E7E6E6"/>
-          </w:tcPr>
-          <w:p>
-            <w:pPr>
-              <w:spacing w:before="20" w:after="20" w:line="240" w:lineRule="auto"/>
-              <w:jc w:val="right"/>
-              <w:rPr>
-                <w:rFonts w:asciiTheme="minorHAnsi" w:hAnsiTheme="minorHAnsi" w:cstheme="minorHAnsi"/>
-              </w:rPr>
-            </w:pPr>
-            <w:r>
-              <w:rPr>
-                <w:rFonts w:asciiTheme="minorHAnsi" w:hAnsiTheme="minorHAnsi" w:cstheme="minorHAnsi"/>
-                <w:b/>
-                <w:sz w:val="19"/>
-                <w:szCs w:val="19"/>
-              </w:rPr>
-              <w:t xml:space="preserve">Coefficient</w:t>
-            </w:r>
-          </w:p>
-        </w:tc>
-        <w:tc>
-          <w:tcPr>
-            <w:tcW w:w="2528" w:type="dxa"/>
-            <w:shd w:val="clear" w:color="auto" w:fill="E7E6E6"/>
-          </w:tcPr>
-          <w:p>
-            <w:pPr>
-              <w:spacing w:before="20" w:after="20" w:line="240" w:lineRule="auto"/>
-              <w:jc w:val="right"/>
-              <w:rPr>
-                <w:rFonts w:asciiTheme="minorHAnsi" w:hAnsiTheme="minorHAnsi" w:cstheme="minorHAnsi"/>
-              </w:rPr>
-            </w:pPr>
-            <w:r>
-              <w:rPr>
-                <w:rFonts w:asciiTheme="minorHAnsi" w:hAnsiTheme="minorHAnsi" w:cstheme="minorHAnsi"/>
-                <w:b/>
-                <w:sz w:val="19"/>
-                <w:szCs w:val="19"/>
-              </w:rPr>
-              <w:t xml:space="preserve">Std. error</w:t>
-            </w:r>
-          </w:p>
-        </w:tc>
-      </w:tr>
-      <w:tr>
-        <w:trPr>
-          <w:cantSplit/>
-        </w:trPr>
-        <w:tc>
-          <w:tcPr>
-            <w:tcW w:w="4305" w:type="dxa"/>
-          </w:tcPr>
-          <w:p>
-            <w:pPr>
-              <w:spacing w:before="20" w:after="20" w:line="240" w:lineRule="auto"/>
-              <w:jc w:val="left"/>
-              <w:rPr>
-                <w:rFonts w:asciiTheme="minorHAnsi" w:hAnsiTheme="minorHAnsi" w:cstheme="minorHAnsi"/>
-              </w:rPr>
-            </w:pPr>
-            <w:r>
-              <w:rPr>
-                <w:rFonts w:asciiTheme="minorHAnsi" w:hAnsiTheme="minorHAnsi" w:cstheme="minorHAnsi"/>
-                <w:sz w:val="19"/>
-                <w:szCs w:val="19"/>
-              </w:rPr>
-              <w:t xml:space="preserve">Constant</w:t>
-            </w:r>
-          </w:p>
-        </w:tc>
-        <w:tc>
-          <w:tcPr>
-            <w:tcW w:w="2527" w:type="dxa"/>
-          </w:tcPr>
-          <w:p>
-            <w:pPr>
-              <w:spacing w:before="20" w:after="20" w:line="240" w:lineRule="auto"/>
-              <w:jc w:val="right"/>
-              <w:rPr>
-                <w:rFonts w:asciiTheme="minorHAnsi" w:hAnsiTheme="minorHAnsi" w:cstheme="minorHAnsi"/>
-              </w:rPr>
-            </w:pPr>
-            <w:r>
-              <w:rPr>
-                <w:rFonts w:asciiTheme="minorHAnsi" w:hAnsiTheme="minorHAnsi" w:cstheme="minorHAnsi"/>
-                <w:sz w:val="19"/>
-                <w:szCs w:val="19"/>
-              </w:rPr>
-              <w:t xml:space="preserve">0.215</w:t>
-            </w:r>
-          </w:p>
-        </w:tc>
-        <w:tc>
-          <w:tcPr>
-            <w:tcW w:w="2528" w:type="dxa"/>
-          </w:tcPr>
-          <w:p>
-            <w:pPr>
-              <w:spacing w:before="20" w:after="20" w:line="240" w:lineRule="auto"/>
-              <w:jc w:val="right"/>
-              <w:rPr>
-                <w:rFonts w:asciiTheme="minorHAnsi" w:hAnsiTheme="minorHAnsi" w:cstheme="minorHAnsi"/>
-              </w:rPr>
-            </w:pPr>
-            <w:r>
-              <w:rPr>
-                <w:rFonts w:asciiTheme="minorHAnsi" w:hAnsiTheme="minorHAnsi" w:cstheme="minorHAnsi"/>
-                <w:sz w:val="19"/>
-                <w:szCs w:val="19"/>
-              </w:rPr>
-              <w:t xml:space="preserve">0.011</w:t>
-            </w:r>
-          </w:p>
-        </w:tc>
-      </w:tr>
-      <w:tr>
-        <w:trPr>
-          <w:cantSplit/>
-        </w:trPr>
-        <w:tc>
-          <w:tcPr>
-            <w:tcW w:w="4305" w:type="dxa"/>
-          </w:tcPr>
-          <w:p>
-            <w:pPr>
-              <w:spacing w:before="20" w:after="20" w:line="240" w:lineRule="auto"/>
-              <w:jc w:val="left"/>
-              <w:rPr>
-                <w:rFonts w:asciiTheme="minorHAnsi" w:hAnsiTheme="minorHAnsi" w:cstheme="minorHAnsi"/>
-              </w:rPr>
-            </w:pPr>
-            <w:r>
-              <w:rPr>
-                <w:rFonts w:asciiTheme="minorHAnsi" w:hAnsiTheme="minorHAnsi" w:cstheme="minorHAnsi"/>
-                <w:sz w:val="19"/>
-                <w:szCs w:val="19"/>
-              </w:rPr>
-              <w:t xml:space="preserve">Trailing games share</w:t>
-            </w:r>
-          </w:p>
-        </w:tc>
-        <w:tc>
-          <w:tcPr>
-            <w:tcW w:w="2527" w:type="dxa"/>
-          </w:tcPr>
-          <w:p>
-            <w:pPr>
-              <w:spacing w:before="20" w:after="20" w:line="240" w:lineRule="auto"/>
-              <w:jc w:val="right"/>
-              <w:rPr>
-                <w:rFonts w:asciiTheme="minorHAnsi" w:hAnsiTheme="minorHAnsi" w:cstheme="minorHAnsi"/>
-              </w:rPr>
-            </w:pPr>
-            <w:r>
-              <w:rPr>
-                <w:rFonts w:asciiTheme="minorHAnsi" w:hAnsiTheme="minorHAnsi" w:cstheme="minorHAnsi"/>
-                <w:sz w:val="19"/>
-                <w:szCs w:val="19"/>
-              </w:rPr>
-              <w:t xml:space="preserve">0.599</w:t>
-            </w:r>
-          </w:p>
-        </w:tc>
-        <w:tc>
-          <w:tcPr>
-            <w:tcW w:w="2528" w:type="dxa"/>
-          </w:tcPr>
-          <w:p>
-            <w:pPr>
-              <w:spacing w:before="20" w:after="20" w:line="240" w:lineRule="auto"/>
-              <w:jc w:val="right"/>
-              <w:rPr>
-                <w:rFonts w:asciiTheme="minorHAnsi" w:hAnsiTheme="minorHAnsi" w:cstheme="minorHAnsi"/>
-              </w:rPr>
-            </w:pPr>
-            <w:r>
-              <w:rPr>
-                <w:rFonts w:asciiTheme="minorHAnsi" w:hAnsiTheme="minorHAnsi" w:cstheme="minorHAnsi"/>
-                <w:sz w:val="19"/>
-                <w:szCs w:val="19"/>
-              </w:rPr>
-              <w:t xml:space="preserve">0.014</w:t>
-            </w:r>
-          </w:p>
-        </w:tc>
-      </w:tr>
-      <w:tr>
-        <w:trPr>
-          <w:cantSplit/>
-        </w:trPr>
-        <w:tc>
-          <w:tcPr>
-            <w:tcW w:w="4305" w:type="dxa"/>
-          </w:tcPr>
-          <w:p>
-            <w:pPr>
-              <w:spacing w:before="20" w:after="20" w:line="240" w:lineRule="auto"/>
-              <w:jc w:val="left"/>
-              <w:rPr>
-                <w:rFonts w:asciiTheme="minorHAnsi" w:hAnsiTheme="minorHAnsi" w:cstheme="minorHAnsi"/>
-              </w:rPr>
-            </w:pPr>
-            <w:r>
-              <w:rPr>
-                <w:rFonts w:asciiTheme="minorHAnsi" w:hAnsiTheme="minorHAnsi" w:cstheme="minorHAnsi"/>
-                <w:sz w:val="19"/>
-                <w:szCs w:val="19"/>
-              </w:rPr>
-              <w:t xml:space="preserve">Defence</w:t>
-            </w:r>
-          </w:p>
-        </w:tc>
-        <w:tc>
-          <w:tcPr>
-            <w:tcW w:w="2527" w:type="dxa"/>
-          </w:tcPr>
-          <w:p>
-            <w:pPr>
-              <w:spacing w:before="20" w:after="20" w:line="240" w:lineRule="auto"/>
-              <w:jc w:val="right"/>
-              <w:rPr>
-                <w:rFonts w:asciiTheme="minorHAnsi" w:hAnsiTheme="minorHAnsi" w:cstheme="minorHAnsi"/>
-              </w:rPr>
-            </w:pPr>
-            <w:r>
-              <w:rPr>
-                <w:rFonts w:asciiTheme="minorHAnsi" w:hAnsiTheme="minorHAnsi" w:cstheme="minorHAnsi"/>
-                <w:sz w:val="19"/>
-                <w:szCs w:val="19"/>
-              </w:rPr>
-              <w:t xml:space="preserve">0.007</w:t>
-            </w:r>
-          </w:p>
-        </w:tc>
-        <w:tc>
-          <w:tcPr>
-            <w:tcW w:w="2528" w:type="dxa"/>
-          </w:tcPr>
-          <w:p>
-            <w:pPr>
-              <w:spacing w:before="20" w:after="20" w:line="240" w:lineRule="auto"/>
-              <w:jc w:val="right"/>
-              <w:rPr>
-                <w:rFonts w:asciiTheme="minorHAnsi" w:hAnsiTheme="minorHAnsi" w:cstheme="minorHAnsi"/>
-              </w:rPr>
-            </w:pPr>
-            <w:r>
-              <w:rPr>
-                <w:rFonts w:asciiTheme="minorHAnsi" w:hAnsiTheme="minorHAnsi" w:cstheme="minorHAnsi"/>
-                <w:sz w:val="19"/>
-                <w:szCs w:val="19"/>
-              </w:rPr>
-              <w:t xml:space="preserve">0.006</w:t>
-            </w:r>
-          </w:p>
-        </w:tc>
-      </w:tr>
-      <w:tr>
-        <w:trPr>
-          <w:cantSplit/>
-        </w:trPr>
-        <w:tc>
-          <w:tcPr>
-            <w:tcW w:w="4305" w:type="dxa"/>
-          </w:tcPr>
-          <w:p>
-            <w:pPr>
-              <w:spacing w:before="20" w:after="20" w:line="240" w:lineRule="auto"/>
-              <w:jc w:val="left"/>
-              <w:rPr>
-                <w:rFonts w:asciiTheme="minorHAnsi" w:hAnsiTheme="minorHAnsi" w:cstheme="minorHAnsi"/>
-              </w:rPr>
-            </w:pPr>
-            <w:r>
-              <w:rPr>
-                <w:rFonts w:asciiTheme="minorHAnsi" w:hAnsiTheme="minorHAnsi" w:cstheme="minorHAnsi"/>
-                <w:sz w:val="19"/>
-                <w:szCs w:val="19"/>
-              </w:rPr>
-              <w:t xml:space="preserve">Experience (seasons)</w:t>
-            </w:r>
-          </w:p>
-        </w:tc>
-        <w:tc>
-          <w:tcPr>
-            <w:tcW w:w="2527" w:type="dxa"/>
-          </w:tcPr>
-          <w:p>
-            <w:pPr>
-              <w:spacing w:before="20" w:after="20" w:line="240" w:lineRule="auto"/>
-              <w:jc w:val="right"/>
-              <w:rPr>
-                <w:rFonts w:asciiTheme="minorHAnsi" w:hAnsiTheme="minorHAnsi" w:cstheme="minorHAnsi"/>
-              </w:rPr>
-            </w:pPr>
-            <w:r>
-              <w:rPr>
-                <w:rFonts w:asciiTheme="minorHAnsi" w:hAnsiTheme="minorHAnsi" w:cstheme="minorHAnsi"/>
-                <w:sz w:val="19"/>
-                <w:szCs w:val="19"/>
-              </w:rPr>
-              <w:t xml:space="preserve">0.0036</w:t>
-            </w:r>
-          </w:p>
-        </w:tc>
-        <w:tc>
-          <w:tcPr>
-            <w:tcW w:w="2528" w:type="dxa"/>
-          </w:tcPr>
-          <w:p>
-            <w:pPr>
-              <w:spacing w:before="20" w:after="20" w:line="240" w:lineRule="auto"/>
-              <w:jc w:val="right"/>
-              <w:rPr>
-                <w:rFonts w:asciiTheme="minorHAnsi" w:hAnsiTheme="minorHAnsi" w:cstheme="minorHAnsi"/>
-              </w:rPr>
-            </w:pPr>
-            <w:r>
-              <w:rPr>
-                <w:rFonts w:asciiTheme="minorHAnsi" w:hAnsiTheme="minorHAnsi" w:cstheme="minorHAnsi"/>
-                <w:sz w:val="19"/>
-                <w:szCs w:val="19"/>
-              </w:rPr>
-              <w:t xml:space="preserve">0.0010</w:t>
-            </w:r>
-          </w:p>
-        </w:tc>
-      </w:tr>
-      <w:tr>
-        <w:trPr>
-          <w:cantSplit/>
-        </w:trPr>
-        <w:tc>
-          <w:tcPr>
-            <w:tcW w:w="4305" w:type="dxa"/>
-          </w:tcPr>
-          <w:p>
-            <w:pPr>
-              <w:spacing w:before="20" w:after="20" w:line="240" w:lineRule="auto"/>
-              <w:jc w:val="left"/>
-              <w:rPr>
-                <w:rFonts w:asciiTheme="minorHAnsi" w:hAnsiTheme="minorHAnsi" w:cstheme="minorHAnsi"/>
-              </w:rPr>
-            </w:pPr>
-            <w:r>
-              <w:rPr>
-                <w:rFonts w:asciiTheme="minorHAnsi" w:hAnsiTheme="minorHAnsi" w:cstheme="minorHAnsi"/>
-                <w:sz w:val="19"/>
-                <w:szCs w:val="19"/>
-              </w:rPr>
-              <w:t xml:space="preserve">Age − 27</w:t>
-            </w:r>
-          </w:p>
-        </w:tc>
-        <w:tc>
-          <w:tcPr>
-            <w:tcW w:w="2527" w:type="dxa"/>
-          </w:tcPr>
-          <w:p>
-            <w:pPr>
-              <w:spacing w:before="20" w:after="20" w:line="240" w:lineRule="auto"/>
-              <w:jc w:val="right"/>
-              <w:rPr>
-                <w:rFonts w:asciiTheme="minorHAnsi" w:hAnsiTheme="minorHAnsi" w:cstheme="minorHAnsi"/>
-              </w:rPr>
-            </w:pPr>
-            <w:r>
-              <w:rPr>
-                <w:rFonts w:asciiTheme="minorHAnsi" w:hAnsiTheme="minorHAnsi" w:cstheme="minorHAnsi"/>
-                <w:sz w:val="19"/>
-                <w:szCs w:val="19"/>
-              </w:rPr>
-              <w:t xml:space="preserve">-0.0079</w:t>
-            </w:r>
-          </w:p>
-        </w:tc>
-        <w:tc>
-          <w:tcPr>
-            <w:tcW w:w="2528" w:type="dxa"/>
-          </w:tcPr>
-          <w:p>
-            <w:pPr>
-              <w:spacing w:before="20" w:after="20" w:line="240" w:lineRule="auto"/>
-              <w:jc w:val="right"/>
-              <w:rPr>
-                <w:rFonts w:asciiTheme="minorHAnsi" w:hAnsiTheme="minorHAnsi" w:cstheme="minorHAnsi"/>
-              </w:rPr>
-            </w:pPr>
-            <w:r>
-              <w:rPr>
-                <w:rFonts w:asciiTheme="minorHAnsi" w:hAnsiTheme="minorHAnsi" w:cstheme="minorHAnsi"/>
-                <w:sz w:val="19"/>
-                <w:szCs w:val="19"/>
-              </w:rPr>
-              <w:t xml:space="preserve">0.0007</w:t>
-            </w:r>
-          </w:p>
-        </w:tc>
-      </w:tr>
-      <w:tr>
-        <w:trPr>
-          <w:cantSplit/>
-        </w:trPr>
-        <w:tc>
-          <w:tcPr>
-            <w:tcW w:w="4305" w:type="dxa"/>
-          </w:tcPr>
-          <w:p>
-            <w:pPr>
-              <w:spacing w:before="20" w:after="20" w:line="240" w:lineRule="auto"/>
-              <w:jc w:val="left"/>
-              <w:rPr>
-                <w:rFonts w:asciiTheme="minorHAnsi" w:hAnsiTheme="minorHAnsi" w:cstheme="minorHAnsi"/>
-              </w:rPr>
-            </w:pPr>
-            <w:r>
-              <w:rPr>
-                <w:rFonts w:asciiTheme="minorHAnsi" w:hAnsiTheme="minorHAnsi" w:cstheme="minorHAnsi"/>
-                <w:sz w:val="19"/>
-                <w:szCs w:val="19"/>
-              </w:rPr>
-              <w:t xml:space="preserve">Trailing total</w:t>
-            </w:r>
-          </w:p>
-        </w:tc>
-        <w:tc>
-          <w:tcPr>
-            <w:tcW w:w="2527" w:type="dxa"/>
-          </w:tcPr>
-          <w:p>
-            <w:pPr>
-              <w:spacing w:before="20" w:after="20" w:line="240" w:lineRule="auto"/>
-              <w:jc w:val="right"/>
-              <w:rPr>
-                <w:rFonts w:asciiTheme="minorHAnsi" w:hAnsiTheme="minorHAnsi" w:cstheme="minorHAnsi"/>
-              </w:rPr>
-            </w:pPr>
-            <w:r>
-              <w:rPr>
-                <w:rFonts w:asciiTheme="minorHAnsi" w:hAnsiTheme="minorHAnsi" w:cstheme="minorHAnsi"/>
-                <w:sz w:val="19"/>
-                <w:szCs w:val="19"/>
-              </w:rPr>
-              <w:t xml:space="preserve">0.091</w:t>
-            </w:r>
-          </w:p>
-        </w:tc>
-        <w:tc>
-          <w:tcPr>
-            <w:tcW w:w="2528" w:type="dxa"/>
-          </w:tcPr>
-          <w:p>
-            <w:pPr>
-              <w:spacing w:before="20" w:after="20" w:line="240" w:lineRule="auto"/>
-              <w:jc w:val="right"/>
-              <w:rPr>
-                <w:rFonts w:asciiTheme="minorHAnsi" w:hAnsiTheme="minorHAnsi" w:cstheme="minorHAnsi"/>
-              </w:rPr>
-            </w:pPr>
-            <w:r>
-              <w:rPr>
-                <w:rFonts w:asciiTheme="minorHAnsi" w:hAnsiTheme="minorHAnsi" w:cstheme="minorHAnsi"/>
-                <w:sz w:val="19"/>
-                <w:szCs w:val="19"/>
-              </w:rPr>
-              <w:t xml:space="preserve">0.006</w:t>
-            </w:r>
-          </w:p>
-        </w:tc>
-      </w:tr>
-      <w:tr>
-        <w:trPr>
-          <w:cantSplit/>
-        </w:trPr>
-        <w:tc>
-          <w:tcPr>
-            <w:tcW w:w="4305" w:type="dxa"/>
-          </w:tcPr>
-          <w:p>
-            <w:pPr>
-              <w:spacing w:before="20" w:after="20" w:line="240" w:lineRule="auto"/>
-              <w:jc w:val="left"/>
-              <w:rPr>
-                <w:rFonts w:asciiTheme="minorHAnsi" w:hAnsiTheme="minorHAnsi" w:cstheme="minorHAnsi"/>
-              </w:rPr>
-            </w:pPr>
-            <w:r>
-              <w:rPr>
-                <w:rFonts w:asciiTheme="minorHAnsi" w:hAnsiTheme="minorHAnsi" w:cstheme="minorHAnsi"/>
-                <w:sz w:val="19"/>
-                <w:szCs w:val="19"/>
-              </w:rPr>
-              <w:t xml:space="preserve">Trailing total above one win</w:t>
-            </w:r>
-          </w:p>
-        </w:tc>
-        <w:tc>
-          <w:tcPr>
-            <w:tcW w:w="2527" w:type="dxa"/>
-          </w:tcPr>
-          <w:p>
-            <w:pPr>
-              <w:spacing w:before="20" w:after="20" w:line="240" w:lineRule="auto"/>
-              <w:jc w:val="right"/>
-              <w:rPr>
-                <w:rFonts w:asciiTheme="minorHAnsi" w:hAnsiTheme="minorHAnsi" w:cstheme="minorHAnsi"/>
-              </w:rPr>
-            </w:pPr>
-            <w:r>
-              <w:rPr>
-                <w:rFonts w:asciiTheme="minorHAnsi" w:hAnsiTheme="minorHAnsi" w:cstheme="minorHAnsi"/>
-                <w:sz w:val="19"/>
-                <w:szCs w:val="19"/>
-              </w:rPr>
-              <w:t xml:space="preserve">-0.084</w:t>
-            </w:r>
-          </w:p>
-        </w:tc>
-        <w:tc>
-          <w:tcPr>
-            <w:tcW w:w="2528" w:type="dxa"/>
-          </w:tcPr>
-          <w:p>
-            <w:pPr>
-              <w:spacing w:before="20" w:after="20" w:line="240" w:lineRule="auto"/>
-              <w:jc w:val="right"/>
-              <w:rPr>
-                <w:rFonts w:asciiTheme="minorHAnsi" w:hAnsiTheme="minorHAnsi" w:cstheme="minorHAnsi"/>
-              </w:rPr>
-            </w:pPr>
-            <w:r>
-              <w:rPr>
-                <w:rFonts w:asciiTheme="minorHAnsi" w:hAnsiTheme="minorHAnsi" w:cstheme="minorHAnsi"/>
-                <w:sz w:val="19"/>
-                <w:szCs w:val="19"/>
-              </w:rPr>
-              <w:t xml:space="preserve">0.008</w:t>
-            </w:r>
-          </w:p>
-        </w:tc>
-      </w:tr>
-    </w:tbl>
-    <w:p>
-      <w:pPr>
-        <w:spacing w:after="80"/>
-      </w:pPr>
-    </w:p>
-    <w:p>
-      <w:pPr>
-        <w:rPr>
-          <w:rFonts w:asciiTheme="minorHAnsi" w:hAnsiTheme="minorHAnsi" w:cstheme="minorHAnsi"/>
-        </w:rPr>
-      </w:pPr>
-      <w:r>
-        <w:rPr>
-          <w:rFonts w:asciiTheme="minorHAnsi" w:hAnsiTheme="minorHAnsi" w:cstheme="minorHAnsi"/>
-        </w:rPr>
-        <w:t xml:space="preserve">Level matters up to about one win and very little above it: the two level coefficients nearly cancel past one win. The weight on the trailing share falls with the horizon, from 0.60 in the valuation season to 0.26 five seasons out, as recent availability says less about the more distant future. Marchessault’s forecast share is 0.88 in 2024-25, about 72 games.</w:t>
-      </w:r>
-    </w:p>
-    <w:p>
-      <w:pPr>
-        <w:rPr>
-          <w:rFonts w:asciiTheme="minorHAnsi" w:hAnsiTheme="minorHAnsi" w:cstheme="minorHAnsi"/>
-        </w:rPr>
-      </w:pPr>
-      <w:r>
-        <w:rPr>
-          <w:rFonts w:asciiTheme="minorHAnsi" w:hAnsiTheme="minorHAnsi" w:cstheme="minorHAnsi"/>
-        </w:rPr>
-        <w:t xml:space="preserve">Adding the level terms to the games share lowered season-WAR RMSE in the development tests from 0.8640 to 0.8596 (in a version of the model with the fitted aging equation).</w:t>
-      </w:r>
-    </w:p>
-    <w:p>
-      <w:pPr>
-        <w:pStyle w:val="Heading1"/>
-        <w:rPr>
-          <w:rFonts w:asciiTheme="minorHAnsi" w:hAnsiTheme="minorHAnsi" w:cstheme="minorHAnsi"/>
-        </w:rPr>
-      </w:pPr>
-      <w:r>
-        <w:rPr>
-          <w:rFonts w:asciiTheme="minorHAnsi" w:hAnsiTheme="minorHAnsi" w:cstheme="minorHAnsi"/>
-        </w:rPr>
-        <w:t xml:space="preserve">6. The Chance of Playing</w:t>
-      </w:r>
-    </w:p>
-    <w:p>
-      <w:pPr>
-        <w:rPr>
-          <w:rFonts w:asciiTheme="minorHAnsi" w:hAnsiTheme="minorHAnsi" w:cstheme="minorHAnsi"/>
-        </w:rPr>
-      </w:pPr>
-      <w:r>
-        <w:rPr>
-          <w:rFonts w:asciiTheme="minorHAnsi" w:hAnsiTheme="minorHAnsi" w:cstheme="minorHAnsi"/>
-        </w:rPr>
-        <w:t xml:space="preserve">There is always a risk that a player does not play a season his contract covers: he may retire, be injured for the full season, be loaned to another league, or be unable to keep an NHL job. The chance of playing is the probability that he appears in at least one NHL game in a given season. The rate and the games share are forecast for the same event, a season in which he plays. The product in Section 2 is therefore an expectation of one quantity.</w:t>
-      </w:r>
-    </w:p>
-    <w:p>
-      <w:pPr>
-        <w:pStyle w:val="Heading2"/>
-        <w:rPr>
-          <w:rFonts w:asciiTheme="minorHAnsi" w:hAnsiTheme="minorHAnsi" w:cstheme="minorHAnsi"/>
-        </w:rPr>
-      </w:pPr>
-      <w:r>
-        <w:rPr>
-          <w:rFonts w:asciiTheme="minorHAnsi" w:hAnsiTheme="minorHAnsi" w:cstheme="minorHAnsi"/>
-        </w:rPr>
         <w:t xml:space="preserve">The model</w:t>
       </w:r>
     </w:p>
@@ -2455,20 +1780,33 @@
         <w:rPr>
           <w:rFonts w:asciiTheme="minorHAnsi" w:hAnsiTheme="minorHAnsi" w:cstheme="minorHAnsi"/>
         </w:rPr>
-        <w:t xml:space="preserve">For each season ahead, the model fits a separate logistic regression, refitted on each valuation date. A logistic regression turns a weighted sum of inputs into a probability between zero and one. The inputs are the player’s age in the target season and its square, his trailing total, his trailing games share, his experience, his position, and whether he is under contract for the target season.</w:t>
-      </w:r>
-    </w:p>
-    <w:p>
-      <w:pPr>
-        <w:rPr>
-          <w:rFonts w:asciiTheme="minorHAnsi" w:hAnsiTheme="minorHAnsi" w:cstheme="minorHAnsi"/>
-        </w:rPr>
-      </w:pPr>
-      <w:r>
-        <w:rPr>
-          <w:rFonts w:asciiTheme="minorHAnsi" w:hAnsiTheme="minorHAnsi" w:cstheme="minorHAnsi"/>
-        </w:rPr>
-        <w:t xml:space="preserve">Contract status counts only deals signed on or before the valuation date. The contract export cannot show complete contract status for seasons before 2018-19, so in those seasons each player is recorded as not under contract. A separate indicator for those seasons was considered and left out. Where a column has too little support at a horizon (fewer than 50 rows on either side of a yes-or-no input), it is dropped from that horizon’s fit. The fit carries a very small penalty that keeps coefficients finite where contract status nearly determines the outcome, and each probability is held between 0.005 and 0.995.</w:t>
+        <w:t xml:space="preserve">For each season ahead, the model fits a separate logistic regression, refitted on each valuation date. A logistic regression turns a weighted sum of inputs into a probability between zero and one. The inputs are the player’s age in the target season and its square, his trailing total, his trailing games share, his experience, his position, whether he is under contract for the target season, and whether the target season is one whose contract status cannot be observed.</w:t>
+      </w:r>
+    </w:p>
+    <w:p>
+      <w:pPr>
+        <w:rPr>
+          <w:rFonts w:asciiTheme="minorHAnsi" w:hAnsiTheme="minorHAnsi" w:cstheme="minorHAnsi"/>
+        </w:rPr>
+      </w:pPr>
+      <w:r>
+        <w:rPr>
+          <w:rFonts w:asciiTheme="minorHAnsi" w:hAnsiTheme="minorHAnsi" w:cstheme="minorHAnsi"/>
+        </w:rPr>
+        <w:t xml:space="preserve">Contract status counts only deals signed on or before the valuation date. The contract export holds only contracts that ended in 2018-19 or later, so it cannot show contract status for earlier seasons. In those seasons each player is recorded as not under contract, and a separate indicator marks the season as unobservable; without it, the model would read each player in those seasons as a free agent. Where a column has too little support at a horizon (fewer than 50 rows on either side of a yes-or-no input), it is dropped from that horizon’s fit. The fit carries a very small penalty that keeps coefficients finite where contract status nearly determines the outcome, and each probability is held between 0.005 and 0.995.</w:t>
+      </w:r>
+    </w:p>
+    <w:p>
+      <w:pPr>
+        <w:rPr>
+          <w:rFonts w:asciiTheme="minorHAnsi" w:hAnsiTheme="minorHAnsi" w:cstheme="minorHAnsi"/>
+        </w:rPr>
+      </w:pPr>
+      <w:r>
+        <w:rPr>
+          <w:rFonts w:asciiTheme="minorHAnsi" w:hAnsiTheme="minorHAnsi" w:cstheme="minorHAnsi"/>
+        </w:rPr>
+        <w:t xml:space="preserve">The indicator was tested on the development valuations. It lowered season-WAR error from 0.8088 to 0.8085 (lower in 1,979 of 2,000 career resamples) and mean absolute error from 0.4673 to 0.4653, while the log loss of the probabilities rose slightly, from 0.4044 to 0.4047. It can enter a fit only from the 2019 valuation on, the first whose training seasons include 2018-19.</w:t>
       </w:r>
     </w:p>
     <w:p>
@@ -2494,7 +1832,7 @@
         <w:rPr>
           <w:rFonts w:asciiTheme="minorHAnsi" w:hAnsiTheme="minorHAnsi" w:cstheme="minorHAnsi"/>
         </w:rPr>
-        <w:t xml:space="preserve">The fits for the 2024 valuation are below for the valuation season and three seasons out. Standard errors are clustered by player.</w:t>
+        <w:t xml:space="preserve">The fits for the 2024 valuation are below for the valuation season and three seasons out. The coefficients are the model’s; the standard errors, clustered by player, come from the same fit without the penalty, whose coefficients agree with the model’s to within 0.0001.</w:t>
       </w:r>
     </w:p>
     <w:tbl>
@@ -2691,7 +2029,7 @@
                 <w:sz w:val="19"/>
                 <w:szCs w:val="19"/>
               </w:rPr>
-              <w:t xml:space="preserve">-1.655</w:t>
+              <w:t xml:space="preserve">-2.5763</w:t>
             </w:r>
           </w:p>
         </w:tc>
@@ -2713,7 +2051,7 @@
                 <w:sz w:val="19"/>
                 <w:szCs w:val="19"/>
               </w:rPr>
-              <w:t xml:space="preserve">0.091</w:t>
+              <w:t xml:space="preserve">0.1180</w:t>
             </w:r>
           </w:p>
         </w:tc>
@@ -2735,7 +2073,7 @@
                 <w:sz w:val="19"/>
                 <w:szCs w:val="19"/>
               </w:rPr>
-              <w:t xml:space="preserve">-1.576</w:t>
+              <w:t xml:space="preserve">-1.6812</w:t>
             </w:r>
           </w:p>
         </w:tc>
@@ -2757,7 +2095,7 @@
                 <w:sz w:val="19"/>
                 <w:szCs w:val="19"/>
               </w:rPr>
-              <w:t xml:space="preserve">0.104</w:t>
+              <w:t xml:space="preserve">0.1184</w:t>
             </w:r>
           </w:p>
         </w:tc>
@@ -2806,7 +2144,7 @@
                 <w:sz w:val="19"/>
                 <w:szCs w:val="19"/>
               </w:rPr>
-              <w:t xml:space="preserve">-0.281</w:t>
+              <w:t xml:space="preserve">-0.3087</w:t>
             </w:r>
           </w:p>
         </w:tc>
@@ -2828,7 +2166,7 @@
                 <w:sz w:val="19"/>
                 <w:szCs w:val="19"/>
               </w:rPr>
-              <w:t xml:space="preserve">0.013</w:t>
+              <w:t xml:space="preserve">0.0140</w:t>
             </w:r>
           </w:p>
         </w:tc>
@@ -2850,7 +2188,7 @@
                 <w:sz w:val="19"/>
                 <w:szCs w:val="19"/>
               </w:rPr>
-              <w:t xml:space="preserve">-0.375</w:t>
+              <w:t xml:space="preserve">-0.3840</w:t>
             </w:r>
           </w:p>
         </w:tc>
@@ -2872,7 +2210,7 @@
                 <w:sz w:val="19"/>
                 <w:szCs w:val="19"/>
               </w:rPr>
-              <w:t xml:space="preserve">0.023</w:t>
+              <w:t xml:space="preserve">0.0236</w:t>
             </w:r>
           </w:p>
         </w:tc>
@@ -2921,7 +2259,7 @@
                 <w:sz w:val="19"/>
                 <w:szCs w:val="19"/>
               </w:rPr>
-              <w:t xml:space="preserve">0.0016</w:t>
+              <w:t xml:space="preserve">0.0024</w:t>
             </w:r>
           </w:p>
         </w:tc>
@@ -2965,7 +2303,7 @@
                 <w:sz w:val="19"/>
                 <w:szCs w:val="19"/>
               </w:rPr>
-              <w:t xml:space="preserve">0.0015</w:t>
+              <w:t xml:space="preserve">0.0018</w:t>
             </w:r>
           </w:p>
         </w:tc>
@@ -3036,7 +2374,7 @@
                 <w:sz w:val="19"/>
                 <w:szCs w:val="19"/>
               </w:rPr>
-              <w:t xml:space="preserve">0.881</w:t>
+              <w:t xml:space="preserve">0.8272</w:t>
             </w:r>
           </w:p>
         </w:tc>
@@ -3058,7 +2396,7 @@
                 <w:sz w:val="19"/>
                 <w:szCs w:val="19"/>
               </w:rPr>
-              <w:t xml:space="preserve">0.057</w:t>
+              <w:t xml:space="preserve">0.0579</w:t>
             </w:r>
           </w:p>
         </w:tc>
@@ -3080,7 +2418,7 @@
                 <w:sz w:val="19"/>
                 <w:szCs w:val="19"/>
               </w:rPr>
-              <w:t xml:space="preserve">0.902</w:t>
+              <w:t xml:space="preserve">0.8930</w:t>
             </w:r>
           </w:p>
         </w:tc>
@@ -3102,7 +2440,7 @@
                 <w:sz w:val="19"/>
                 <w:szCs w:val="19"/>
               </w:rPr>
-              <w:t xml:space="preserve">0.059</w:t>
+              <w:t xml:space="preserve">0.0584</w:t>
             </w:r>
           </w:p>
         </w:tc>
@@ -3151,7 +2489,7 @@
                 <w:sz w:val="19"/>
                 <w:szCs w:val="19"/>
               </w:rPr>
-              <w:t xml:space="preserve">4.522</w:t>
+              <w:t xml:space="preserve">4.4012</w:t>
             </w:r>
           </w:p>
         </w:tc>
@@ -3173,7 +2511,7 @@
                 <w:sz w:val="19"/>
                 <w:szCs w:val="19"/>
               </w:rPr>
-              <w:t xml:space="preserve">0.161</w:t>
+              <w:t xml:space="preserve">0.1602</w:t>
             </w:r>
           </w:p>
         </w:tc>
@@ -3195,7 +2533,7 @@
                 <w:sz w:val="19"/>
                 <w:szCs w:val="19"/>
               </w:rPr>
-              <w:t xml:space="preserve">3.872</w:t>
+              <w:t xml:space="preserve">3.8355</w:t>
             </w:r>
           </w:p>
         </w:tc>
@@ -3217,7 +2555,7 @@
                 <w:sz w:val="19"/>
                 <w:szCs w:val="19"/>
               </w:rPr>
-              <w:t xml:space="preserve">0.180</w:t>
+              <w:t xml:space="preserve">0.1773</w:t>
             </w:r>
           </w:p>
         </w:tc>
@@ -3266,7 +2604,7 @@
                 <w:sz w:val="19"/>
                 <w:szCs w:val="19"/>
               </w:rPr>
-              <w:t xml:space="preserve">-0.013</w:t>
+              <w:t xml:space="preserve">0.0507</w:t>
             </w:r>
           </w:p>
         </w:tc>
@@ -3288,7 +2626,7 @@
                 <w:sz w:val="19"/>
                 <w:szCs w:val="19"/>
               </w:rPr>
-              <w:t xml:space="preserve">0.011</w:t>
+              <w:t xml:space="preserve">0.0126</w:t>
             </w:r>
           </w:p>
         </w:tc>
@@ -3310,7 +2648,7 @@
                 <w:sz w:val="19"/>
                 <w:szCs w:val="19"/>
               </w:rPr>
-              <w:t xml:space="preserve">-0.019</w:t>
+              <w:t xml:space="preserve">0.0006</w:t>
             </w:r>
           </w:p>
         </w:tc>
@@ -3332,7 +2670,7 @@
                 <w:sz w:val="19"/>
                 <w:szCs w:val="19"/>
               </w:rPr>
-              <w:t xml:space="preserve">0.017</w:t>
+              <w:t xml:space="preserve">0.0189</w:t>
             </w:r>
           </w:p>
         </w:tc>
@@ -3381,7 +2719,7 @@
                 <w:sz w:val="19"/>
                 <w:szCs w:val="19"/>
               </w:rPr>
-              <w:t xml:space="preserve">0.356</w:t>
+              <w:t xml:space="preserve">0.3451</w:t>
             </w:r>
           </w:p>
         </w:tc>
@@ -3403,7 +2741,7 @@
                 <w:sz w:val="19"/>
                 <w:szCs w:val="19"/>
               </w:rPr>
-              <w:t xml:space="preserve">0.066</w:t>
+              <w:t xml:space="preserve">0.0663</w:t>
             </w:r>
           </w:p>
         </w:tc>
@@ -3425,7 +2763,7 @@
                 <w:sz w:val="19"/>
                 <w:szCs w:val="19"/>
               </w:rPr>
-              <w:t xml:space="preserve">0.510</w:t>
+              <w:t xml:space="preserve">0.5094</w:t>
             </w:r>
           </w:p>
         </w:tc>
@@ -3447,7 +2785,7 @@
                 <w:sz w:val="19"/>
                 <w:szCs w:val="19"/>
               </w:rPr>
-              <w:t xml:space="preserve">0.087</w:t>
+              <w:t xml:space="preserve">0.0872</w:t>
             </w:r>
           </w:p>
         </w:tc>
@@ -3496,7 +2834,7 @@
                 <w:sz w:val="19"/>
                 <w:szCs w:val="19"/>
               </w:rPr>
-              <w:t xml:space="preserve">1.240</w:t>
+              <w:t xml:space="preserve">1.9193</w:t>
             </w:r>
           </w:p>
         </w:tc>
@@ -3518,7 +2856,7 @@
                 <w:sz w:val="19"/>
                 <w:szCs w:val="19"/>
               </w:rPr>
-              <w:t xml:space="preserve">0.086</w:t>
+              <w:t xml:space="preserve">0.0966</w:t>
             </w:r>
           </w:p>
         </w:tc>
@@ -3540,7 +2878,7 @@
                 <w:sz w:val="19"/>
                 <w:szCs w:val="19"/>
               </w:rPr>
-              <w:t xml:space="preserve">1.132</w:t>
+              <w:t xml:space="preserve">1.1760</w:t>
             </w:r>
           </w:p>
         </w:tc>
@@ -3562,7 +2900,7 @@
                 <w:sz w:val="19"/>
                 <w:szCs w:val="19"/>
               </w:rPr>
-              <w:t xml:space="preserve">0.183</w:t>
+              <w:t xml:space="preserve">0.1837</w:t>
             </w:r>
           </w:p>
         </w:tc>
@@ -3589,7 +2927,7 @@
                 <w:sz w:val="19"/>
                 <w:szCs w:val="19"/>
               </w:rPr>
-              <w:t xml:space="preserve">Player-seasons (players)</w:t>
+              <w:t xml:space="preserve">Status not observable</w:t>
             </w:r>
           </w:p>
         </w:tc>
@@ -3611,7 +2949,7 @@
                 <w:sz w:val="19"/>
                 <w:szCs w:val="19"/>
               </w:rPr>
-              <w:t xml:space="preserve">15,408 (2,338)</w:t>
+              <w:t xml:space="preserve">1.0970</w:t>
             </w:r>
           </w:p>
         </w:tc>
@@ -3633,7 +2971,7 @@
                 <w:sz w:val="19"/>
                 <w:szCs w:val="19"/>
               </w:rPr>
-              <w:t xml:space="preserve"/>
+              <w:t xml:space="preserve">0.0824</w:t>
             </w:r>
           </w:p>
         </w:tc>
@@ -3655,7 +2993,7 @@
                 <w:sz w:val="19"/>
                 <w:szCs w:val="19"/>
               </w:rPr>
-              <w:t xml:space="preserve">12,407 (2,036)</w:t>
+              <w:t xml:space="preserve">0.1753</w:t>
             </w:r>
           </w:p>
         </w:tc>
@@ -3677,7 +3015,7 @@
                 <w:sz w:val="19"/>
                 <w:szCs w:val="19"/>
               </w:rPr>
-              <w:t xml:space="preserve"/>
+              <w:t xml:space="preserve">0.0875</w:t>
             </w:r>
           </w:p>
         </w:tc>
@@ -3704,6 +3042,121 @@
                 <w:sz w:val="19"/>
                 <w:szCs w:val="19"/>
               </w:rPr>
+              <w:t xml:space="preserve">Player-seasons (players)</w:t>
+            </w:r>
+          </w:p>
+        </w:tc>
+        <w:tc>
+          <w:tcPr>
+            <w:tcW w:w="1544" w:type="dxa"/>
+          </w:tcPr>
+          <w:p>
+            <w:pPr>
+              <w:spacing w:before="20" w:after="20" w:line="240" w:lineRule="auto"/>
+              <w:jc w:val="right"/>
+              <w:rPr>
+                <w:rFonts w:asciiTheme="minorHAnsi" w:hAnsiTheme="minorHAnsi" w:cstheme="minorHAnsi"/>
+              </w:rPr>
+            </w:pPr>
+            <w:r>
+              <w:rPr>
+                <w:rFonts w:asciiTheme="minorHAnsi" w:hAnsiTheme="minorHAnsi" w:cstheme="minorHAnsi"/>
+                <w:sz w:val="19"/>
+                <w:szCs w:val="19"/>
+              </w:rPr>
+              <w:t xml:space="preserve">15,408 (2,338)</w:t>
+            </w:r>
+          </w:p>
+        </w:tc>
+        <w:tc>
+          <w:tcPr>
+            <w:tcW w:w="1544" w:type="dxa"/>
+          </w:tcPr>
+          <w:p>
+            <w:pPr>
+              <w:spacing w:before="20" w:after="20" w:line="240" w:lineRule="auto"/>
+              <w:jc w:val="right"/>
+              <w:rPr>
+                <w:rFonts w:asciiTheme="minorHAnsi" w:hAnsiTheme="minorHAnsi" w:cstheme="minorHAnsi"/>
+              </w:rPr>
+            </w:pPr>
+            <w:r>
+              <w:rPr>
+                <w:rFonts w:asciiTheme="minorHAnsi" w:hAnsiTheme="minorHAnsi" w:cstheme="minorHAnsi"/>
+                <w:sz w:val="19"/>
+                <w:szCs w:val="19"/>
+              </w:rPr>
+              <w:t xml:space="preserve"/>
+            </w:r>
+          </w:p>
+        </w:tc>
+        <w:tc>
+          <w:tcPr>
+            <w:tcW w:w="1544" w:type="dxa"/>
+          </w:tcPr>
+          <w:p>
+            <w:pPr>
+              <w:spacing w:before="20" w:after="20" w:line="240" w:lineRule="auto"/>
+              <w:jc w:val="right"/>
+              <w:rPr>
+                <w:rFonts w:asciiTheme="minorHAnsi" w:hAnsiTheme="minorHAnsi" w:cstheme="minorHAnsi"/>
+              </w:rPr>
+            </w:pPr>
+            <w:r>
+              <w:rPr>
+                <w:rFonts w:asciiTheme="minorHAnsi" w:hAnsiTheme="minorHAnsi" w:cstheme="minorHAnsi"/>
+                <w:sz w:val="19"/>
+                <w:szCs w:val="19"/>
+              </w:rPr>
+              <w:t xml:space="preserve">12,407 (2,036)</w:t>
+            </w:r>
+          </w:p>
+        </w:tc>
+        <w:tc>
+          <w:tcPr>
+            <w:tcW w:w="1546" w:type="dxa"/>
+          </w:tcPr>
+          <w:p>
+            <w:pPr>
+              <w:spacing w:before="20" w:after="20" w:line="240" w:lineRule="auto"/>
+              <w:jc w:val="right"/>
+              <w:rPr>
+                <w:rFonts w:asciiTheme="minorHAnsi" w:hAnsiTheme="minorHAnsi" w:cstheme="minorHAnsi"/>
+              </w:rPr>
+            </w:pPr>
+            <w:r>
+              <w:rPr>
+                <w:rFonts w:asciiTheme="minorHAnsi" w:hAnsiTheme="minorHAnsi" w:cstheme="minorHAnsi"/>
+                <w:sz w:val="19"/>
+                <w:szCs w:val="19"/>
+              </w:rPr>
+              <w:t xml:space="preserve"/>
+            </w:r>
+          </w:p>
+        </w:tc>
+      </w:tr>
+      <w:tr>
+        <w:trPr>
+          <w:cantSplit/>
+        </w:trPr>
+        <w:tc>
+          <w:tcPr>
+            <w:tcW w:w="3182" w:type="dxa"/>
+          </w:tcPr>
+          <w:p>
+            <w:pPr>
+              <w:spacing w:before="20" w:after="20" w:line="240" w:lineRule="auto"/>
+              <w:jc w:val="left"/>
+              <w:rPr>
+                <w:rFonts w:asciiTheme="minorHAnsi" w:hAnsiTheme="minorHAnsi" w:cstheme="minorHAnsi"/>
+              </w:rPr>
+            </w:pPr>
+            <w:r>
+              <w:rPr>
+                <w:rFonts w:asciiTheme="minorHAnsi" w:hAnsiTheme="minorHAnsi" w:cstheme="minorHAnsi"/>
+                <w:sz w:val="19"/>
+                <w:szCs w:val="19"/>
+              </w:rPr>
               <w:t xml:space="preserve">Share who played</w:t>
             </w:r>
           </w:p>
@@ -3813,20 +3266,20 @@
         <w:rPr>
           <w:rFonts w:asciiTheme="minorHAnsi" w:hAnsiTheme="minorHAnsi" w:cstheme="minorHAnsi"/>
         </w:rPr>
-        <w:t xml:space="preserve">Recent availability and level carry most of the signal. Near age 27, each year of age lowers the odds of playing by about a quarter in the valuation season. Being under contract raises the odds by a factor of about 3.5.</w:t>
-      </w:r>
-    </w:p>
-    <w:p>
-      <w:pPr>
-        <w:rPr>
-          <w:rFonts w:asciiTheme="minorHAnsi" w:hAnsiTheme="minorHAnsi" w:cstheme="minorHAnsi"/>
-        </w:rPr>
-      </w:pPr>
-      <w:r>
-        <w:rPr>
-          <w:rFonts w:asciiTheme="minorHAnsi" w:hAnsiTheme="minorHAnsi" w:cstheme="minorHAnsi"/>
-        </w:rPr>
-        <w:t xml:space="preserve">For Marchessault, under contract through 2028-29, the chance of playing is 0.99 in 2024-25, then 0.98, 0.94, 0.88, and 0.78 as he ages through 38.</w:t>
+        <w:t xml:space="preserve">Recent availability and level carry most of the signal. Near age 27, each year of age lowers the odds of playing by about a quarter in the valuation season. Being under contract raises the odds by a factor of about 6.8 in the valuation season and 3.2 three seasons out, against a player whose status is observed and who is not under contract.</w:t>
+      </w:r>
+    </w:p>
+    <w:p>
+      <w:pPr>
+        <w:rPr>
+          <w:rFonts w:asciiTheme="minorHAnsi" w:hAnsiTheme="minorHAnsi" w:cstheme="minorHAnsi"/>
+        </w:rPr>
+      </w:pPr>
+      <w:r>
+        <w:rPr>
+          <w:rFonts w:asciiTheme="minorHAnsi" w:hAnsiTheme="minorHAnsi" w:cstheme="minorHAnsi"/>
+        </w:rPr>
+        <w:t xml:space="preserve">For Marchessault, under contract through 2028-29, the chance of playing is 0.988 in 2024-25, then 0.977, 0.947, 0.886, and 0.785 as he ages through 38.</w:t>
       </w:r>
     </w:p>
     <w:p>
@@ -3879,7 +3332,7 @@
         <w:rPr>
           <w:rFonts w:asciiTheme="minorHAnsi" w:hAnsiTheme="minorHAnsi" w:cstheme="minorHAnsi"/>
         </w:rPr>
-        <w:t xml:space="preserve">One miss remains. Good players stay in the league longer than the training seasons suggest. Three to five seasons out, players with three or more wins aged 29 to 31 are given a 0.85 chance of playing, and 0.98 of them played. Contract status known at the valuation date covers seasons already signed, so it cannot say whether a star will re-sign three years later. Neither additional age terms nor a level hinge moved this miss.</w:t>
+        <w:t xml:space="preserve">One miss remains. Players under contract stay in the league longer than the forecast expects from three seasons out. On the development valuations, among players under contract for the season, the forecast chance of playing five seasons out averaged 0.690 against 0.858 who played (233 player-seasons), and 0.781 against 0.910 for players with two or more trailing wins (89). Contract status known at the valuation date covers seasons already signed, so it cannot say whether a player will re-sign. A version fitted only on seasons under contract narrowed the gap (0.729 five seasons out) but raised the log loss from 0.4047 to 0.4056 and was not adopted.</w:t>
       </w:r>
     </w:p>
     <w:p>
@@ -4227,7 +3680,7 @@
                 <w:sz w:val="19"/>
                 <w:szCs w:val="19"/>
               </w:rPr>
-              <w:t xml:space="preserve">0.00</w:t>
+              <w:t xml:space="preserve">0.000</w:t>
             </w:r>
           </w:p>
         </w:tc>
@@ -4249,7 +3702,7 @@
                 <w:sz w:val="19"/>
                 <w:szCs w:val="19"/>
               </w:rPr>
-              <w:t xml:space="preserve">2.37</w:t>
+              <w:t xml:space="preserve">2.070</w:t>
             </w:r>
           </w:p>
         </w:tc>
@@ -4271,7 +3724,7 @@
                 <w:sz w:val="19"/>
                 <w:szCs w:val="19"/>
               </w:rPr>
-              <w:t xml:space="preserve">0.88</w:t>
+              <w:t xml:space="preserve">0.914</w:t>
             </w:r>
           </w:p>
         </w:tc>
@@ -4293,7 +3746,7 @@
                 <w:sz w:val="19"/>
                 <w:szCs w:val="19"/>
               </w:rPr>
-              <w:t xml:space="preserve">2.08</w:t>
+              <w:t xml:space="preserve">1.891</w:t>
             </w:r>
           </w:p>
         </w:tc>
@@ -4315,7 +3768,7 @@
                 <w:sz w:val="19"/>
                 <w:szCs w:val="19"/>
               </w:rPr>
-              <w:t xml:space="preserve">0.99</w:t>
+              <w:t xml:space="preserve">0.988</w:t>
             </w:r>
           </w:p>
         </w:tc>
@@ -4337,7 +3790,7 @@
                 <w:sz w:val="19"/>
                 <w:szCs w:val="19"/>
               </w:rPr>
-              <w:t xml:space="preserve">2.05</w:t>
+              <w:t xml:space="preserve">1.869</w:t>
             </w:r>
           </w:p>
         </w:tc>
@@ -4408,7 +3861,7 @@
                 <w:sz w:val="19"/>
                 <w:szCs w:val="19"/>
               </w:rPr>
-              <w:t xml:space="preserve">-0.37</w:t>
+              <w:t xml:space="preserve">-0.280</w:t>
             </w:r>
           </w:p>
         </w:tc>
@@ -4430,7 +3883,7 @@
                 <w:sz w:val="19"/>
                 <w:szCs w:val="19"/>
               </w:rPr>
-              <w:t xml:space="preserve">2.00</w:t>
+              <w:t xml:space="preserve">1.791</w:t>
             </w:r>
           </w:p>
         </w:tc>
@@ -4452,7 +3905,7 @@
                 <w:sz w:val="19"/>
                 <w:szCs w:val="19"/>
               </w:rPr>
-              <w:t xml:space="preserve">0.85</w:t>
+              <w:t xml:space="preserve">0.896</w:t>
             </w:r>
           </w:p>
         </w:tc>
@@ -4474,7 +3927,7 @@
                 <w:sz w:val="19"/>
                 <w:szCs w:val="19"/>
               </w:rPr>
-              <w:t xml:space="preserve">1.70</w:t>
+              <w:t xml:space="preserve">1.604</w:t>
             </w:r>
           </w:p>
         </w:tc>
@@ -4496,7 +3949,7 @@
                 <w:sz w:val="19"/>
                 <w:szCs w:val="19"/>
               </w:rPr>
-              <w:t xml:space="preserve">0.98</w:t>
+              <w:t xml:space="preserve">0.977</w:t>
             </w:r>
           </w:p>
         </w:tc>
@@ -4518,7 +3971,7 @@
                 <w:sz w:val="19"/>
                 <w:szCs w:val="19"/>
               </w:rPr>
-              <w:t xml:space="preserve">1.66</w:t>
+              <w:t xml:space="preserve">1.566</w:t>
             </w:r>
           </w:p>
         </w:tc>
@@ -4589,7 +4042,7 @@
                 <w:sz w:val="19"/>
                 <w:szCs w:val="19"/>
               </w:rPr>
-              <w:t xml:space="preserve">-0.60</w:t>
+              <w:t xml:space="preserve">-0.540</w:t>
             </w:r>
           </w:p>
         </w:tc>
@@ -4611,7 +4064,7 @@
                 <w:sz w:val="19"/>
                 <w:szCs w:val="19"/>
               </w:rPr>
-              <w:t xml:space="preserve">1.76</w:t>
+              <w:t xml:space="preserve">1.530</w:t>
             </w:r>
           </w:p>
         </w:tc>
@@ -4633,7 +4086,7 @@
                 <w:sz w:val="19"/>
                 <w:szCs w:val="19"/>
               </w:rPr>
-              <w:t xml:space="preserve">0.84</w:t>
+              <w:t xml:space="preserve">0.892</w:t>
             </w:r>
           </w:p>
         </w:tc>
@@ -4655,7 +4108,7 @@
                 <w:sz w:val="19"/>
                 <w:szCs w:val="19"/>
               </w:rPr>
-              <w:t xml:space="preserve">1.48</w:t>
+              <w:t xml:space="preserve">1.365</w:t>
             </w:r>
           </w:p>
         </w:tc>
@@ -4677,7 +4130,7 @@
                 <w:sz w:val="19"/>
                 <w:szCs w:val="19"/>
               </w:rPr>
-              <w:t xml:space="preserve">0.94</w:t>
+              <w:t xml:space="preserve">0.947</w:t>
             </w:r>
           </w:p>
         </w:tc>
@@ -4699,7 +4152,7 @@
                 <w:sz w:val="19"/>
                 <w:szCs w:val="19"/>
               </w:rPr>
-              <w:t xml:space="preserve">1.40</w:t>
+              <w:t xml:space="preserve">1.292</w:t>
             </w:r>
           </w:p>
         </w:tc>
@@ -4770,7 +4223,7 @@
                 <w:sz w:val="19"/>
                 <w:szCs w:val="19"/>
               </w:rPr>
-              <w:t xml:space="preserve">-0.81</w:t>
+              <w:t xml:space="preserve">-0.778</w:t>
             </w:r>
           </w:p>
         </w:tc>
@@ -4792,7 +4245,7 @@
                 <w:sz w:val="19"/>
                 <w:szCs w:val="19"/>
               </w:rPr>
-              <w:t xml:space="preserve">1.56</w:t>
+              <w:t xml:space="preserve">1.292</w:t>
             </w:r>
           </w:p>
         </w:tc>
@@ -4814,7 +4267,7 @@
                 <w:sz w:val="19"/>
                 <w:szCs w:val="19"/>
               </w:rPr>
-              <w:t xml:space="preserve">0.84</w:t>
+              <w:t xml:space="preserve">0.903</w:t>
             </w:r>
           </w:p>
         </w:tc>
@@ -4836,7 +4289,7 @@
                 <w:sz w:val="19"/>
                 <w:szCs w:val="19"/>
               </w:rPr>
-              <w:t xml:space="preserve">1.31</w:t>
+              <w:t xml:space="preserve">1.168</w:t>
             </w:r>
           </w:p>
         </w:tc>
@@ -4858,7 +4311,7 @@
                 <w:sz w:val="19"/>
                 <w:szCs w:val="19"/>
               </w:rPr>
-              <w:t xml:space="preserve">0.88</w:t>
+              <w:t xml:space="preserve">0.886</w:t>
             </w:r>
           </w:p>
         </w:tc>
@@ -4880,7 +4333,7 @@
                 <w:sz w:val="19"/>
                 <w:szCs w:val="19"/>
               </w:rPr>
-              <w:t xml:space="preserve">1.15</w:t>
+              <w:t xml:space="preserve">1.034</w:t>
             </w:r>
           </w:p>
         </w:tc>
@@ -4951,7 +4404,7 @@
                 <w:sz w:val="19"/>
                 <w:szCs w:val="19"/>
               </w:rPr>
-              <w:t xml:space="preserve">-1.25</w:t>
+              <w:t xml:space="preserve">-1.181</w:t>
             </w:r>
           </w:p>
         </w:tc>
@@ -4973,7 +4426,7 @@
                 <w:sz w:val="19"/>
                 <w:szCs w:val="19"/>
               </w:rPr>
-              <w:t xml:space="preserve">1.12</w:t>
+              <w:t xml:space="preserve">0.890</w:t>
             </w:r>
           </w:p>
         </w:tc>
@@ -4995,7 +4448,7 @@
                 <w:sz w:val="19"/>
                 <w:szCs w:val="19"/>
               </w:rPr>
-              <w:t xml:space="preserve">0.85</w:t>
+              <w:t xml:space="preserve">0.931</w:t>
             </w:r>
           </w:p>
         </w:tc>
@@ -5017,7 +4470,7 @@
                 <w:sz w:val="19"/>
                 <w:szCs w:val="19"/>
               </w:rPr>
-              <w:t xml:space="preserve">0.95</w:t>
+              <w:t xml:space="preserve">0.828</w:t>
             </w:r>
           </w:p>
         </w:tc>
@@ -5039,7 +4492,7 @@
                 <w:sz w:val="19"/>
                 <w:szCs w:val="19"/>
               </w:rPr>
-              <w:t xml:space="preserve">0.78</w:t>
+              <w:t xml:space="preserve">0.785</w:t>
             </w:r>
           </w:p>
         </w:tc>
@@ -5061,7 +4514,7 @@
                 <w:sz w:val="19"/>
                 <w:szCs w:val="19"/>
               </w:rPr>
-              <w:t xml:space="preserve">0.74</w:t>
+              <w:t xml:space="preserve">0.650</w:t>
             </w:r>
           </w:p>
         </w:tc>
@@ -5082,7 +4535,7 @@
         <w:rPr>
           <w:rFonts w:asciiTheme="minorHAnsi" w:hAnsiTheme="minorHAnsi" w:cstheme="minorHAnsi"/>
         </w:rPr>
-        <w:t xml:space="preserve">The forecast expects a steady decline. The first two seasons fell much further: 0.60 WAR in 78 games in 2024-25, and -0.31 in 62 games in 2025-26. One case cannot measure accuracy, but it shows the size of the misses a single forecast carries. The pricing document allows for them through the forecast spread behind the salary floor.</w:t>
+        <w:t xml:space="preserve">The forecast expects a steady decline. The first two seasons fell much further: 0.60 WAR in 78 games in 2024-25, and -0.31 in 62 games in 2025-26, against 1.89 and 1.60 forecast if he played. One case cannot measure accuracy, but it shows the size of the misses a single forecast carries. The pricing document allows for them through the forecast spread behind the salary floor.</w:t>
       </w:r>
     </w:p>
     <w:p>
@@ -5109,20 +4562,20 @@
         <w:rPr>
           <w:rFonts w:asciiTheme="minorHAnsi" w:hAnsiTheme="minorHAnsi" w:cstheme="minorHAnsi"/>
         </w:rPr>
-        <w:t xml:space="preserve">The forecast was chosen on valuation dates 2015-2021 and then scored on 2022-2025, under a rule declared before the run. The run was repeated once after the age table was rebuilt; the second run is the result of record. On 9,063 forecasts of 1,171 players, zero to three seasons ahead, its season-WAR RMSE was 0.9001. The earlier version of the model, a 60/40 trailing total walked along the aging curve’s percentage path with a chained exit table, scored 0.9724. It was more accurate in each of 2,000 resamples of players. Those valuation dates were not unseen: an earlier test of the scoring code had scored the earlier model and a version without contract status on them.</w:t>
-      </w:r>
-    </w:p>
-    <w:p>
-      <w:pPr>
-        <w:rPr>
-          <w:rFonts w:asciiTheme="minorHAnsi" w:hAnsiTheme="minorHAnsi" w:cstheme="minorHAnsi"/>
-        </w:rPr>
-      </w:pPr>
-      <w:r>
-        <w:rPr>
-          <w:rFonts w:asciiTheme="minorHAnsi" w:hAnsiTheme="minorHAnsi" w:cstheme="minorHAnsi"/>
-        </w:rPr>
-        <w:t xml:space="preserve">The forecast has three recorded limits. The best players are under-forecast by about a quarter of a win a season, and five players carry most of it. Good players’ late chance of playing is too low. Six-to-eight-year contracts are under-valued (Pricing document, Section 4). Each is reported with the results; no tested change has removed it.</w:t>
+        <w:t xml:space="preserve">The forecast’s design was chosen on the development valuation dates, 2015-2021. On those dates its season-WAR RMSE is 0.8075 over 40,510 player-seasons of 1,609 players, zero to five seasons ahead. An earlier version, with a fitted starting rate and trailing weights chosen from the data, was scored once on 2022-2025 under a rule declared before the run. Its RMSE was 0.9001 on 9,063 forecasts of 1,171 players zero to three seasons ahead, against 0.9724 for the version before it, and it was more accurate in each of 2,000 resamples of players. Those valuation dates were not unseen: an earlier test of the scoring code had scored two models on them. The current forecast changes the starting rate, the aging curve’s level and departures, the games share, and the chance of playing. It has not been scored on 2022-2025, and how it will be validated has not yet been decided.</w:t>
+      </w:r>
+    </w:p>
+    <w:p>
+      <w:pPr>
+        <w:rPr>
+          <w:rFonts w:asciiTheme="minorHAnsi" w:hAnsiTheme="minorHAnsi" w:cstheme="minorHAnsi"/>
+        </w:rPr>
+      </w:pPr>
+      <w:r>
+        <w:rPr>
+          <w:rFonts w:asciiTheme="minorHAnsi" w:hAnsiTheme="minorHAnsi" w:cstheme="minorHAnsi"/>
+        </w:rPr>
+        <w:t xml:space="preserve">The forecast has three recorded limits. The best players are under-forecast by about a third of a win a season one to five seasons out. Players with one or two counted seasons start too high. Players under contract are given too low a chance of playing from three seasons out. Each is reported with the results; none of the changes tested for them was adopted.</w:t>
       </w:r>
     </w:p>
     <w:sectPr>

</xml_diff>

<commit_message>
Documents: trailing-total figures on 50/30/20, not 60/40
The forecast runs at 0.14 + 0.72 x its own 50/30/20 trailing total (defence
0.67, forwards 0.72); grouped on that total, players at three wins or more
are under-forecast by 0.402 WAR a season one to five seasons out. The 60/40
comparisons are gone except two labelled as earlier versions.

Co-Authored-By: Claude Opus 5.5 <noreply@anthropic.com>
Claude-Session: https://claude.ai/code/session_01KJQGvXbJQHJSXYBMj2qArp
</commit_message>
<xml_diff>
--- a/40_DOCS/Supervisor_Drafts/Data, Production, and Aging.docx
+++ b/40_DOCS/Supervisor_Drafts/Data, Production, and Aging.docx
@@ -624,7 +624,7 @@
         <w:rPr>
           <w:rFonts w:asciiTheme="minorHAnsi" w:hAnsiTheme="minorHAnsi" w:cstheme="minorHAnsi"/>
         </w:rPr>
-        <w:t xml:space="preserve">The best players are under-forecast. On the development valuations, players with three or more trailing wins (a 60/40 total of their last two seasons) were under-forecast by 0.333 WAR a season one to five seasons out, and by 0.035 in the valuation season. The 95% range for the first figure is -0.63 to -0.01, from 2,000 resamples of the 88 players’ careers. Each trailing-win group is under-forecast one to five seasons out, by 0.038 to 0.115 WAR a season below three wins, so the miss is largest for the best players. Which step causes it has not been established.</w:t>
+        <w:t xml:space="preserve">The best players are under-forecast. On the development valuations, players whose trailing total (the 50/30/20 average of their WAR over the three seasons before the valuation season) was three wins or more were under-forecast by 0.402 WAR a season one to five seasons out, and by 0.041 in the valuation season. The 95% range for the first figure is -0.74 to -0.07, from 2,000 resamples of the 73 players’ careers. Each trailing-win group is under-forecast one to five seasons out, by 0.035 to 0.105 WAR a season below three wins, so the miss is largest for the best players. Which step causes it has not been established.</w:t>
       </w:r>
     </w:p>
     <w:p>
@@ -4575,7 +4575,7 @@
         <w:rPr>
           <w:rFonts w:asciiTheme="minorHAnsi" w:hAnsiTheme="minorHAnsi" w:cstheme="minorHAnsi"/>
         </w:rPr>
-        <w:t xml:space="preserve">The forecast has three recorded limits. The best players are under-forecast by about a third of a win a season one to five seasons out. Players with one or two counted seasons start too high. Players under contract are given too low a chance of playing from three seasons out. Each is reported with the results; none of the changes tested for them was adopted.</w:t>
+        <w:t xml:space="preserve">The forecast has three recorded limits. The best players are under-forecast by about four-tenths of a win a season one to five seasons out. Players with one or two counted seasons start too high. Players under contract are given too low a chance of playing from three seasons out. Each is reported with the results; none of the changes tested for them was adopted.</w:t>
       </w:r>
     </w:p>
     <w:sectPr>

</xml_diff>